<commit_message>
zavisle modely + samostatne modely + data pro superset
</commit_message>
<xml_diff>
--- a/textove_soubory/postup_prace_clear.docx
+++ b/textove_soubory/postup_prace_clear.docx
@@ -19,13 +19,8 @@
       </w:r>
     </w:p>
     <w:p>
-      <w:proofErr w:type="spellStart"/>
-      <w:r>
-        <w:t>Dataset</w:t>
-      </w:r>
-      <w:proofErr w:type="spellEnd"/>
-      <w:r>
-        <w:t xml:space="preserve"> obsahuje 524</w:t>
+      <w:r>
+        <w:t>Dataset obsahuje 524</w:t>
       </w:r>
       <w:r>
         <w:rPr>
@@ -89,21 +84,8 @@
           <w:numId w:val="9"/>
         </w:numPr>
       </w:pPr>
-      <w:proofErr w:type="spellStart"/>
-      <w:r>
-        <w:t>recommendation_metrics</w:t>
-      </w:r>
-      <w:proofErr w:type="spellEnd"/>
-      <w:r>
-        <w:t xml:space="preserve">_*_index – doporučení k expozici dané látce (hodnoty 1–6, </w:t>
-      </w:r>
-      <w:proofErr w:type="spellStart"/>
-      <w:r>
-        <w:t>ordinalní</w:t>
-      </w:r>
-      <w:proofErr w:type="spellEnd"/>
-      <w:r>
-        <w:t xml:space="preserve"> proměnné)</w:t>
+      <w:r>
+        <w:t>recommendation_metrics_*_index – doporučení k expozici dané látce (hodnoty 1–6, ordinalní proměnné)</w:t>
       </w:r>
     </w:p>
     <w:p>
@@ -114,52 +96,12 @@
         </w:numPr>
       </w:pPr>
       <w:r>
-        <w:t xml:space="preserve">Proměnné data_o3, </w:t>
-      </w:r>
-      <w:proofErr w:type="spellStart"/>
-      <w:r>
-        <w:t>data_co</w:t>
-      </w:r>
-      <w:proofErr w:type="spellEnd"/>
-      <w:r>
-        <w:t>, data_so2 obsahují pouze hodnotu NA, nebudou tedy dále využívány.</w:t>
-      </w:r>
-    </w:p>
-    <w:p>
-      <w:r>
-        <w:t xml:space="preserve">Proměnná </w:t>
-      </w:r>
-      <w:proofErr w:type="spellStart"/>
-      <w:r>
-        <w:t>date</w:t>
-      </w:r>
-      <w:proofErr w:type="spellEnd"/>
-      <w:r>
-        <w:t xml:space="preserve"> je ve formátu textu (</w:t>
-      </w:r>
-      <w:proofErr w:type="spellStart"/>
-      <w:r>
-        <w:t>character</w:t>
-      </w:r>
-      <w:proofErr w:type="spellEnd"/>
-      <w:r>
-        <w:t xml:space="preserve">) a bude převedena na časový formát </w:t>
-      </w:r>
-      <w:proofErr w:type="spellStart"/>
-      <w:r>
-        <w:t>POSIXct</w:t>
-      </w:r>
-      <w:proofErr w:type="spellEnd"/>
-      <w:r>
-        <w:t xml:space="preserve">. </w:t>
-      </w:r>
-      <w:proofErr w:type="spellStart"/>
-      <w:r>
-        <w:t>sensor_id</w:t>
-      </w:r>
-      <w:proofErr w:type="spellEnd"/>
-      <w:r>
-        <w:t xml:space="preserve"> identifikuje konkrétní měřicí zařízení.</w:t>
+        <w:t>Proměnné data_o3, data_co, data_so2 obsahují pouze hodnotu NA, nebudou tedy dále využívány.</w:t>
+      </w:r>
+    </w:p>
+    <w:p>
+      <w:r>
+        <w:t>Proměnná date je ve formátu textu (character) a bude převedena na časový formát POSIXct. sensor_id identifikuje konkrétní měřicí zařízení.</w:t>
       </w:r>
     </w:p>
     <w:p>
@@ -830,81 +772,171 @@
           <w:b/>
           <w:bCs/>
         </w:rPr>
-        <w:t>Kvalitativní/</w:t>
-      </w:r>
-      <w:proofErr w:type="spellStart"/>
+        <w:t>Kvalitativní/Ordinalní (indexy 1–6):</w:t>
+      </w:r>
+    </w:p>
+    <w:p>
+      <w:pPr>
+        <w:numPr>
+          <w:ilvl w:val="0"/>
+          <w:numId w:val="11"/>
+        </w:numPr>
+      </w:pPr>
+      <w:r>
+        <w:lastRenderedPageBreak/>
+        <w:t>recommendation_index, recommendation_metrics_no2_index, recommendation_metrics_pm100_index, recommendation_metrics_pm25_index</w:t>
+      </w:r>
+    </w:p>
+    <w:p>
       <w:r>
         <w:rPr>
           <w:b/>
           <w:bCs/>
         </w:rPr>
-        <w:t>Ordinalní</w:t>
-      </w:r>
-      <w:proofErr w:type="spellEnd"/>
+        <w:t>Zajímavé rozdělení ordinalních proměnných (počet výskytů):</w:t>
+      </w:r>
+    </w:p>
+    <w:p>
+      <w:pPr>
+        <w:numPr>
+          <w:ilvl w:val="0"/>
+          <w:numId w:val="12"/>
+        </w:numPr>
+      </w:pPr>
+      <w:r>
+        <w:t>recommendation_index: Nejčastější hodnota je 1 (352</w:t>
+      </w:r>
+      <w:r>
+        <w:rPr>
+          <w:rFonts w:ascii="Arial" w:hAnsi="Arial" w:cs="Arial"/>
+        </w:rPr>
+        <w:t> </w:t>
+      </w:r>
+      <w:r>
+        <w:t>017x), ostatn</w:t>
+      </w:r>
+      <w:r>
+        <w:rPr>
+          <w:rFonts w:ascii="Aptos" w:hAnsi="Aptos" w:cs="Aptos"/>
+        </w:rPr>
+        <w:t>í</w:t>
+      </w:r>
+      <w:r>
+        <w:t xml:space="preserve"> rozlo</w:t>
+      </w:r>
+      <w:r>
+        <w:rPr>
+          <w:rFonts w:ascii="Aptos" w:hAnsi="Aptos" w:cs="Aptos"/>
+        </w:rPr>
+        <w:t>ž</w:t>
+      </w:r>
+      <w:r>
+        <w:t>eny rovnom</w:t>
+      </w:r>
+      <w:r>
+        <w:rPr>
+          <w:rFonts w:ascii="Aptos" w:hAnsi="Aptos" w:cs="Aptos"/>
+        </w:rPr>
+        <w:t>ě</w:t>
+      </w:r>
+      <w:r>
+        <w:t>rn</w:t>
+      </w:r>
+      <w:r>
+        <w:rPr>
+          <w:rFonts w:ascii="Aptos" w:hAnsi="Aptos" w:cs="Aptos"/>
+        </w:rPr>
+        <w:t>ě</w:t>
+      </w:r>
+      <w:r>
+        <w:t>ji.</w:t>
+      </w:r>
+    </w:p>
+    <w:p>
+      <w:pPr>
+        <w:numPr>
+          <w:ilvl w:val="0"/>
+          <w:numId w:val="12"/>
+        </w:numPr>
+      </w:pPr>
+      <w:r>
+        <w:t>recommendation_metrics_pm100_index: Hodnoty 1–6, přičemž 1 = 420</w:t>
+      </w:r>
+      <w:r>
+        <w:rPr>
+          <w:rFonts w:ascii="Arial" w:hAnsi="Arial" w:cs="Arial"/>
+        </w:rPr>
+        <w:t> </w:t>
+      </w:r>
+      <w:r>
+        <w:t>175x, 6 = 1</w:t>
+      </w:r>
+      <w:r>
+        <w:rPr>
+          <w:rFonts w:ascii="Arial" w:hAnsi="Arial" w:cs="Arial"/>
+        </w:rPr>
+        <w:t> </w:t>
+      </w:r>
+      <w:r>
+        <w:t>128x.</w:t>
+      </w:r>
+    </w:p>
+    <w:p>
+      <w:pPr>
+        <w:numPr>
+          <w:ilvl w:val="0"/>
+          <w:numId w:val="12"/>
+        </w:numPr>
+      </w:pPr>
+      <w:r>
+        <w:t>recommendation_metrics_no2_index: Postupně klesající frekvence od 1 (488</w:t>
+      </w:r>
+      <w:r>
+        <w:rPr>
+          <w:rFonts w:ascii="Arial" w:hAnsi="Arial" w:cs="Arial"/>
+        </w:rPr>
+        <w:t> </w:t>
+      </w:r>
+      <w:r>
+        <w:t>858x) a</w:t>
+      </w:r>
+      <w:r>
+        <w:rPr>
+          <w:rFonts w:ascii="Aptos" w:hAnsi="Aptos" w:cs="Aptos"/>
+        </w:rPr>
+        <w:t>ž</w:t>
+      </w:r>
+      <w:r>
+        <w:t xml:space="preserve"> po 6 (17x).</w:t>
+      </w:r>
+    </w:p>
+    <w:p>
+      <w:r>
+        <w:t xml:space="preserve">Proměnné recommendation_metrics_so2_index, co_index a o3_index mají vždy hodnotu </w:t>
+      </w:r>
       <w:r>
         <w:rPr>
           <w:b/>
           <w:bCs/>
         </w:rPr>
-        <w:t xml:space="preserve"> (indexy 1–6):</w:t>
-      </w:r>
-    </w:p>
-    <w:p>
-      <w:pPr>
-        <w:numPr>
-          <w:ilvl w:val="0"/>
-          <w:numId w:val="11"/>
-        </w:numPr>
-      </w:pPr>
-      <w:proofErr w:type="spellStart"/>
-      <w:r>
-        <w:lastRenderedPageBreak/>
-        <w:t>recommendation_index</w:t>
-      </w:r>
-      <w:proofErr w:type="spellEnd"/>
-      <w:r>
-        <w:t>, recommendation_metrics_no2_index, recommendation_metrics_pm100_index, recommendation_metrics_pm25_index</w:t>
-      </w:r>
-    </w:p>
-    <w:p>
-      <w:r>
-        <w:rPr>
-          <w:b/>
-          <w:bCs/>
-        </w:rPr>
-        <w:t xml:space="preserve">Zajímavé rozdělení </w:t>
-      </w:r>
-      <w:proofErr w:type="spellStart"/>
-      <w:r>
-        <w:rPr>
-          <w:b/>
-          <w:bCs/>
-        </w:rPr>
-        <w:t>ordinalních</w:t>
-      </w:r>
-      <w:proofErr w:type="spellEnd"/>
-      <w:r>
-        <w:rPr>
-          <w:b/>
-          <w:bCs/>
-        </w:rPr>
-        <w:t xml:space="preserve"> proměnných (počet výskytů):</w:t>
-      </w:r>
-    </w:p>
-    <w:p>
-      <w:pPr>
-        <w:numPr>
-          <w:ilvl w:val="0"/>
-          <w:numId w:val="12"/>
-        </w:numPr>
-      </w:pPr>
-      <w:proofErr w:type="spellStart"/>
-      <w:r>
-        <w:t>recommendation_index</w:t>
-      </w:r>
-      <w:proofErr w:type="spellEnd"/>
-      <w:r>
-        <w:t>: Nejčastější hodnota je 1 (352</w:t>
+        <w:t>1</w:t>
+      </w:r>
+      <w:r>
+        <w:t>, tedy konstantní – nebudou využity v analýze.</w:t>
+      </w:r>
+    </w:p>
+    <w:p/>
+    <w:p>
+      <w:pPr>
+        <w:pStyle w:val="Nadpis3"/>
+      </w:pPr>
+      <w:r>
+        <w:t>Počasí</w:t>
+      </w:r>
+    </w:p>
+    <w:p>
+      <w:r>
+        <w:t>Dataset obsahuje 53</w:t>
       </w:r>
       <w:r>
         <w:rPr>
@@ -913,54 +945,50 @@
         <w:t> </w:t>
       </w:r>
       <w:r>
-        <w:t>017x), ostatn</w:t>
-      </w:r>
-      <w:r>
-        <w:rPr>
-          <w:rFonts w:ascii="Aptos" w:hAnsi="Aptos" w:cs="Aptos"/>
-        </w:rPr>
-        <w:t>í</w:t>
-      </w:r>
-      <w:r>
-        <w:t xml:space="preserve"> rozlo</w:t>
-      </w:r>
-      <w:r>
-        <w:rPr>
-          <w:rFonts w:ascii="Aptos" w:hAnsi="Aptos" w:cs="Aptos"/>
-        </w:rPr>
-        <w:t>ž</w:t>
-      </w:r>
-      <w:r>
-        <w:t>eny rovnom</w:t>
-      </w:r>
-      <w:r>
-        <w:rPr>
-          <w:rFonts w:ascii="Aptos" w:hAnsi="Aptos" w:cs="Aptos"/>
-        </w:rPr>
-        <w:t>ě</w:t>
-      </w:r>
-      <w:r>
-        <w:t>rn</w:t>
-      </w:r>
-      <w:r>
-        <w:rPr>
-          <w:rFonts w:ascii="Aptos" w:hAnsi="Aptos" w:cs="Aptos"/>
-        </w:rPr>
-        <w:t>ě</w:t>
-      </w:r>
-      <w:r>
-        <w:t>ji.</w:t>
-      </w:r>
-    </w:p>
-    <w:p>
-      <w:pPr>
-        <w:numPr>
-          <w:ilvl w:val="0"/>
-          <w:numId w:val="12"/>
-        </w:numPr>
-      </w:pPr>
-      <w:r>
-        <w:t>recommendation_metrics_pm100_index: Hodnoty 1–6, přičemž 1 = 420</w:t>
+        <w:t>987 z</w:t>
+      </w:r>
+      <w:r>
+        <w:rPr>
+          <w:rFonts w:ascii="Aptos" w:hAnsi="Aptos" w:cs="Aptos"/>
+        </w:rPr>
+        <w:t>á</w:t>
+      </w:r>
+      <w:r>
+        <w:t>znam</w:t>
+      </w:r>
+      <w:r>
+        <w:rPr>
+          <w:rFonts w:ascii="Aptos" w:hAnsi="Aptos" w:cs="Aptos"/>
+        </w:rPr>
+        <w:t>ů</w:t>
+      </w:r>
+      <w:r>
+        <w:t xml:space="preserve"> z jednoho meteorologického senzoru. Pokrývá období od 3. 1. 2024 do 7. 2. 2025 (celkem 401 dní). Denní počet měření se pohybuje od 65 do 236.</w:t>
+      </w:r>
+    </w:p>
+    <w:p>
+      <w:r>
+        <w:t>Všechna měření obsahují údaje o teplotě, vlhkosti, tlaku, větru a srážkách. Proměnná data_leafWetness obsahuje pouze hodnotu NA a nebude dále analyzována.</w:t>
+      </w:r>
+    </w:p>
+    <w:p>
+      <w:r>
+        <w:t>Klíčové proměnné:</w:t>
+      </w:r>
+    </w:p>
+    <w:p>
+      <w:r>
+        <w:t>data_temp1 – teplota vzduchu (°C, min: −13,3; max: 38,5),</w:t>
+      </w:r>
+    </w:p>
+    <w:p>
+      <w:r>
+        <w:t>data_hum1 – relativní vlhkost (%, průměr: 81,1),</w:t>
+      </w:r>
+    </w:p>
+    <w:p>
+      <w:r>
+        <w:t>data_pressure – tlak (Pa, průměr: 97</w:t>
       </w:r>
       <w:r>
         <w:rPr>
@@ -969,220 +997,30 @@
         <w:t> </w:t>
       </w:r>
       <w:r>
-        <w:t>175x, 6 = 1</w:t>
-      </w:r>
-      <w:r>
-        <w:rPr>
-          <w:rFonts w:ascii="Arial" w:hAnsi="Arial" w:cs="Arial"/>
-        </w:rPr>
-        <w:t> </w:t>
-      </w:r>
-      <w:r>
-        <w:t>128x.</w:t>
-      </w:r>
-    </w:p>
-    <w:p>
-      <w:pPr>
-        <w:numPr>
-          <w:ilvl w:val="0"/>
-          <w:numId w:val="12"/>
-        </w:numPr>
-      </w:pPr>
-      <w:r>
-        <w:t>recommendation_metrics_no2_index: Postupně klesající frekvence od 1 (488</w:t>
-      </w:r>
-      <w:r>
-        <w:rPr>
-          <w:rFonts w:ascii="Arial" w:hAnsi="Arial" w:cs="Arial"/>
-        </w:rPr>
-        <w:t> </w:t>
-      </w:r>
-      <w:r>
-        <w:t>858x) a</w:t>
-      </w:r>
-      <w:r>
-        <w:rPr>
-          <w:rFonts w:ascii="Aptos" w:hAnsi="Aptos" w:cs="Aptos"/>
-        </w:rPr>
-        <w:t>ž</w:t>
-      </w:r>
-      <w:r>
-        <w:t xml:space="preserve"> po 6 (17x).</w:t>
-      </w:r>
-    </w:p>
-    <w:p>
-      <w:r>
-        <w:t xml:space="preserve">Proměnné recommendation_metrics_so2_index, </w:t>
-      </w:r>
-      <w:proofErr w:type="spellStart"/>
-      <w:r>
-        <w:t>co_index</w:t>
-      </w:r>
-      <w:proofErr w:type="spellEnd"/>
-      <w:r>
-        <w:t xml:space="preserve"> a o3_index mají vždy hodnotu </w:t>
-      </w:r>
-      <w:r>
-        <w:rPr>
-          <w:b/>
-          <w:bCs/>
-        </w:rPr>
-        <w:t>1</w:t>
-      </w:r>
-      <w:r>
-        <w:t>, tedy konstantní – nebudou využity v analýze.</w:t>
-      </w:r>
-    </w:p>
-    <w:p/>
-    <w:p>
-      <w:pPr>
-        <w:pStyle w:val="Nadpis3"/>
-      </w:pPr>
-      <w:r>
-        <w:t>Počasí</w:t>
-      </w:r>
-    </w:p>
-    <w:p>
-      <w:proofErr w:type="spellStart"/>
-      <w:r>
-        <w:t>Dataset</w:t>
-      </w:r>
-      <w:proofErr w:type="spellEnd"/>
-      <w:r>
-        <w:t xml:space="preserve"> obsahuje 53</w:t>
-      </w:r>
-      <w:r>
-        <w:rPr>
-          <w:rFonts w:ascii="Arial" w:hAnsi="Arial" w:cs="Arial"/>
-        </w:rPr>
-        <w:t> </w:t>
-      </w:r>
-      <w:r>
-        <w:t>987 z</w:t>
-      </w:r>
-      <w:r>
-        <w:rPr>
-          <w:rFonts w:ascii="Aptos" w:hAnsi="Aptos" w:cs="Aptos"/>
-        </w:rPr>
-        <w:t>á</w:t>
-      </w:r>
-      <w:r>
-        <w:t>znam</w:t>
-      </w:r>
-      <w:r>
-        <w:rPr>
-          <w:rFonts w:ascii="Aptos" w:hAnsi="Aptos" w:cs="Aptos"/>
-        </w:rPr>
-        <w:t>ů</w:t>
-      </w:r>
-      <w:r>
-        <w:t xml:space="preserve"> z jednoho meteorologického senzoru. Pokrývá období od 3. 1. 2024 do 7. 2. 2025 (celkem 401 dní). Denní počet měření se pohybuje od 65 do 236.</w:t>
-      </w:r>
-    </w:p>
-    <w:p>
-      <w:r>
-        <w:t xml:space="preserve">Všechna měření obsahují údaje o teplotě, vlhkosti, tlaku, větru a srážkách. Proměnná </w:t>
-      </w:r>
-      <w:proofErr w:type="spellStart"/>
-      <w:r>
-        <w:t>data_leafWetness</w:t>
-      </w:r>
-      <w:proofErr w:type="spellEnd"/>
-      <w:r>
-        <w:t xml:space="preserve"> obsahuje pouze hodnotu NA a nebude dále analyzována.</w:t>
-      </w:r>
-    </w:p>
-    <w:p>
-      <w:r>
-        <w:t>Klíčové proměnné:</w:t>
-      </w:r>
-    </w:p>
-    <w:p>
-      <w:r>
-        <w:t>data_temp1 – teplota vzduchu (°C, min: −13,3; max: 38,5),</w:t>
-      </w:r>
-    </w:p>
-    <w:p>
-      <w:r>
-        <w:t>data_hum1 – relativní vlhkost (%, průměr: 81,1),</w:t>
-      </w:r>
-    </w:p>
-    <w:p>
-      <w:proofErr w:type="spellStart"/>
-      <w:r>
-        <w:t>data_pressure</w:t>
-      </w:r>
-      <w:proofErr w:type="spellEnd"/>
-      <w:r>
-        <w:t xml:space="preserve"> – tlak (Pa, průměr: 97</w:t>
-      </w:r>
-      <w:r>
-        <w:rPr>
-          <w:rFonts w:ascii="Arial" w:hAnsi="Arial" w:cs="Arial"/>
-        </w:rPr>
-        <w:t> </w:t>
-      </w:r>
-      <w:r>
         <w:t>562),</w:t>
       </w:r>
     </w:p>
     <w:p>
-      <w:proofErr w:type="spellStart"/>
-      <w:r>
-        <w:t>data_windSpeed</w:t>
-      </w:r>
-      <w:proofErr w:type="spellEnd"/>
-      <w:r>
-        <w:t xml:space="preserve"> – rychlost větru (m/s, průměr: 2,54),</w:t>
-      </w:r>
-    </w:p>
-    <w:p>
-      <w:proofErr w:type="spellStart"/>
-      <w:r>
-        <w:t>data_windImpact</w:t>
-      </w:r>
-      <w:proofErr w:type="spellEnd"/>
-      <w:r>
-        <w:t xml:space="preserve"> – síla větru (kombinace rychlosti a směru),</w:t>
-      </w:r>
-    </w:p>
-    <w:p>
-      <w:proofErr w:type="spellStart"/>
-      <w:r>
-        <w:t>data_volumeMm</w:t>
-      </w:r>
-      <w:proofErr w:type="spellEnd"/>
-      <w:r>
-        <w:t xml:space="preserve"> – srážky (mm, většina záznamů bez srážek),</w:t>
-      </w:r>
-    </w:p>
-    <w:p>
-      <w:proofErr w:type="spellStart"/>
-      <w:r>
-        <w:t>data_windDir</w:t>
-      </w:r>
-      <w:proofErr w:type="spellEnd"/>
-      <w:r>
-        <w:t xml:space="preserve"> – směr větru jako kategorie (např. „E“, „S“, „SW“, nebo „</w:t>
-      </w:r>
-      <w:proofErr w:type="spellStart"/>
-      <w:r>
-        <w:t>err</w:t>
-      </w:r>
-      <w:proofErr w:type="spellEnd"/>
-      <w:r>
-        <w:t>“ pro chybný záznam).</w:t>
-      </w:r>
-      <w:r>
-        <w:t xml:space="preserve"> – (tuto proměnnou nebudeme uvažovat dále v analýze – museli bychom udělat nějaký hodinový </w:t>
-      </w:r>
-      <w:proofErr w:type="gramStart"/>
-      <w:r>
-        <w:t>průměr</w:t>
-      </w:r>
-      <w:proofErr w:type="gramEnd"/>
-      <w:r>
-        <w:t xml:space="preserve"> a to lze velmi špatně pro rychlost větru)</w:t>
+      <w:r>
+        <w:t>data_windSpeed – rychlost větru (m/s, průměr: 2,54),</w:t>
+      </w:r>
+    </w:p>
+    <w:p>
+      <w:r>
+        <w:t>data_windImpact – síla větru (kombinace rychlosti a směru),</w:t>
+      </w:r>
+    </w:p>
+    <w:p>
+      <w:r>
+        <w:t>data_volumeMm – srážky (mm, většina záznamů bez srážek),</w:t>
+      </w:r>
+    </w:p>
+    <w:p>
+      <w:r>
+        <w:t>data_windDir – směr větru jako kategorie (např. „E“, „S“, „SW“, nebo „err“ pro chybný záznam).</w:t>
+      </w:r>
+      <w:r>
+        <w:t xml:space="preserve"> – (tuto proměnnou nebudeme uvažovat dále v analýze – museli bychom udělat nějaký hodinový průměr a to lze velmi špatně pro rychlost větru)</w:t>
       </w:r>
     </w:p>
     <w:p/>
@@ -1196,13 +1034,8 @@
       </w:r>
     </w:p>
     <w:p>
-      <w:proofErr w:type="spellStart"/>
-      <w:r>
-        <w:t>Dataset</w:t>
-      </w:r>
-      <w:proofErr w:type="spellEnd"/>
-      <w:r>
-        <w:t xml:space="preserve"> obsahuje </w:t>
+      <w:r>
+        <w:t xml:space="preserve">Dataset obsahuje </w:t>
       </w:r>
       <w:r>
         <w:rPr>
@@ -1290,21 +1123,8 @@
           <w:numId w:val="13"/>
         </w:numPr>
       </w:pPr>
-      <w:proofErr w:type="spellStart"/>
-      <w:r>
-        <w:t>X_time</w:t>
-      </w:r>
-      <w:proofErr w:type="spellEnd"/>
-      <w:r>
-        <w:t xml:space="preserve"> – čas měření (ve formátu s časovým pásmem, bude převedeno na </w:t>
-      </w:r>
-      <w:proofErr w:type="spellStart"/>
-      <w:r>
-        <w:t>POSIXct</w:t>
-      </w:r>
-      <w:proofErr w:type="spellEnd"/>
-      <w:r>
-        <w:t>),</w:t>
+      <w:r>
+        <w:t>X_time – čas měření (ve formátu s časovým pásmem, bude převedeno na POSIXct),</w:t>
       </w:r>
     </w:p>
     <w:p>
@@ -1315,15 +1135,7 @@
         </w:numPr>
       </w:pPr>
       <w:r>
-        <w:t>country – stát původu vozidla (např. „CZ“, „</w:t>
-      </w:r>
-      <w:proofErr w:type="spellStart"/>
-      <w:r>
-        <w:t>unknown</w:t>
-      </w:r>
-      <w:proofErr w:type="spellEnd"/>
-      <w:r>
-        <w:t>“),</w:t>
+        <w:t>country – stát původu vozidla (např. „CZ“, „unknown“),</w:t>
       </w:r>
     </w:p>
     <w:p>
@@ -1496,15 +1308,7 @@
     </w:p>
     <w:p>
       <w:r>
-        <w:t xml:space="preserve">Po odstranění chybných a nerelevantních měření (speed == -1 a speed == 0) zůstalo v </w:t>
-      </w:r>
-      <w:proofErr w:type="spellStart"/>
-      <w:r>
-        <w:t>datasetu</w:t>
-      </w:r>
-      <w:proofErr w:type="spellEnd"/>
-      <w:r>
-        <w:t xml:space="preserve"> </w:t>
+        <w:t xml:space="preserve">Po odstranění chybných a nerelevantních měření (speed == -1 a speed == 0) zůstalo v datasetu </w:t>
       </w:r>
       <w:r>
         <w:rPr>
@@ -1772,13 +1576,8 @@
             <w:tcW w:w="1807" w:type="dxa"/>
           </w:tcPr>
           <w:p>
-            <w:proofErr w:type="spellStart"/>
-            <w:r>
-              <w:t>character</w:t>
-            </w:r>
-            <w:proofErr w:type="spellEnd"/>
-            <w:r>
-              <w:t xml:space="preserve"> (identifikátor měření)</w:t>
+            <w:r>
+              <w:t>character (identifikátor měření)</w:t>
             </w:r>
           </w:p>
         </w:tc>
@@ -1789,11 +1588,9 @@
             <w:tcW w:w="4530" w:type="dxa"/>
           </w:tcPr>
           <w:p>
-            <w:proofErr w:type="spellStart"/>
             <w:r>
               <w:t>date</w:t>
             </w:r>
-            <w:proofErr w:type="spellEnd"/>
           </w:p>
         </w:tc>
         <w:tc>
@@ -1811,21 +1608,8 @@
             <w:tcW w:w="1807" w:type="dxa"/>
           </w:tcPr>
           <w:p>
-            <w:proofErr w:type="spellStart"/>
-            <w:r>
-              <w:t>character</w:t>
-            </w:r>
-            <w:proofErr w:type="spellEnd"/>
-            <w:r>
-              <w:t xml:space="preserve"> (časový údaj, bude převeden na </w:t>
-            </w:r>
-            <w:proofErr w:type="spellStart"/>
-            <w:r>
-              <w:t>POSIXct</w:t>
-            </w:r>
-            <w:proofErr w:type="spellEnd"/>
-            <w:r>
-              <w:t>)</w:t>
+            <w:r>
+              <w:t>character (časový údaj, bude převeden na POSIXct)</w:t>
             </w:r>
           </w:p>
         </w:tc>
@@ -1836,11 +1620,9 @@
             <w:tcW w:w="4530" w:type="dxa"/>
           </w:tcPr>
           <w:p>
-            <w:proofErr w:type="spellStart"/>
             <w:r>
               <w:t>sensor_id</w:t>
             </w:r>
-            <w:proofErr w:type="spellEnd"/>
           </w:p>
         </w:tc>
         <w:tc>
@@ -1858,13 +1640,8 @@
             <w:tcW w:w="1807" w:type="dxa"/>
           </w:tcPr>
           <w:p>
-            <w:proofErr w:type="spellStart"/>
-            <w:r>
-              <w:t>integer</w:t>
-            </w:r>
-            <w:proofErr w:type="spellEnd"/>
-            <w:r>
-              <w:t xml:space="preserve"> (ID senzoru)</w:t>
+            <w:r>
+              <w:t>integer (ID senzoru)</w:t>
             </w:r>
           </w:p>
         </w:tc>
@@ -1895,13 +1672,8 @@
             <w:tcW w:w="1807" w:type="dxa"/>
           </w:tcPr>
           <w:p>
-            <w:proofErr w:type="spellStart"/>
-            <w:r>
-              <w:t>numeric</w:t>
-            </w:r>
-            <w:proofErr w:type="spellEnd"/>
-            <w:r>
-              <w:t xml:space="preserve"> (spojitá)</w:t>
+            <w:r>
+              <w:t>numeric (spojitá)</w:t>
             </w:r>
           </w:p>
         </w:tc>
@@ -1932,13 +1704,8 @@
             <w:tcW w:w="1807" w:type="dxa"/>
           </w:tcPr>
           <w:p>
-            <w:proofErr w:type="spellStart"/>
-            <w:r>
-              <w:t>numeric</w:t>
-            </w:r>
-            <w:proofErr w:type="spellEnd"/>
-            <w:r>
-              <w:t xml:space="preserve"> (spojitá)</w:t>
+            <w:r>
+              <w:t>numeric (spojitá)</w:t>
             </w:r>
           </w:p>
         </w:tc>
@@ -1969,13 +1736,8 @@
             <w:tcW w:w="1807" w:type="dxa"/>
           </w:tcPr>
           <w:p>
-            <w:proofErr w:type="spellStart"/>
-            <w:r>
-              <w:t>numeric</w:t>
-            </w:r>
-            <w:proofErr w:type="spellEnd"/>
-            <w:r>
-              <w:t xml:space="preserve"> (spojitá)</w:t>
+            <w:r>
+              <w:t>numeric (spojitá)</w:t>
             </w:r>
           </w:p>
         </w:tc>
@@ -2006,13 +1768,8 @@
             <w:tcW w:w="1807" w:type="dxa"/>
           </w:tcPr>
           <w:p>
-            <w:proofErr w:type="spellStart"/>
-            <w:r>
-              <w:t>numeric</w:t>
-            </w:r>
-            <w:proofErr w:type="spellEnd"/>
-            <w:r>
-              <w:t xml:space="preserve"> (spojitá)</w:t>
+            <w:r>
+              <w:t>numeric (spojitá)</w:t>
             </w:r>
           </w:p>
         </w:tc>
@@ -2043,13 +1800,8 @@
             <w:tcW w:w="1807" w:type="dxa"/>
           </w:tcPr>
           <w:p>
-            <w:proofErr w:type="spellStart"/>
-            <w:r>
-              <w:t>logical</w:t>
-            </w:r>
-            <w:proofErr w:type="spellEnd"/>
-            <w:r>
-              <w:t xml:space="preserve"> (všude NA)</w:t>
+            <w:r>
+              <w:t>logical (všude NA)</w:t>
             </w:r>
           </w:p>
         </w:tc>
@@ -2060,11 +1812,9 @@
             <w:tcW w:w="4530" w:type="dxa"/>
           </w:tcPr>
           <w:p>
-            <w:proofErr w:type="spellStart"/>
             <w:r>
               <w:t>data_co</w:t>
             </w:r>
-            <w:proofErr w:type="spellEnd"/>
           </w:p>
         </w:tc>
         <w:tc>
@@ -2082,13 +1832,8 @@
             <w:tcW w:w="1807" w:type="dxa"/>
           </w:tcPr>
           <w:p>
-            <w:proofErr w:type="spellStart"/>
-            <w:r>
-              <w:t>logical</w:t>
-            </w:r>
-            <w:proofErr w:type="spellEnd"/>
-            <w:r>
-              <w:t xml:space="preserve"> (všude NA)</w:t>
+            <w:r>
+              <w:t>logical (všude NA)</w:t>
             </w:r>
           </w:p>
         </w:tc>
@@ -2119,13 +1864,8 @@
             <w:tcW w:w="1807" w:type="dxa"/>
           </w:tcPr>
           <w:p>
-            <w:proofErr w:type="spellStart"/>
-            <w:r>
-              <w:t>numeric</w:t>
-            </w:r>
-            <w:proofErr w:type="spellEnd"/>
-            <w:r>
-              <w:t xml:space="preserve"> (spojitá, ~50 % záznamů NA)</w:t>
+            <w:r>
+              <w:t>numeric (spojitá, ~50 % záznamů NA)</w:t>
             </w:r>
           </w:p>
         </w:tc>
@@ -2156,13 +1896,8 @@
             <w:tcW w:w="1807" w:type="dxa"/>
           </w:tcPr>
           <w:p>
-            <w:proofErr w:type="spellStart"/>
-            <w:r>
-              <w:t>logical</w:t>
-            </w:r>
-            <w:proofErr w:type="spellEnd"/>
-            <w:r>
-              <w:t xml:space="preserve"> (všude NA)</w:t>
+            <w:r>
+              <w:t>logical (všude NA)</w:t>
             </w:r>
           </w:p>
         </w:tc>
@@ -2173,11 +1908,9 @@
             <w:tcW w:w="4530" w:type="dxa"/>
           </w:tcPr>
           <w:p>
-            <w:proofErr w:type="spellStart"/>
             <w:r>
               <w:t>recommendation_index</w:t>
             </w:r>
-            <w:proofErr w:type="spellEnd"/>
           </w:p>
         </w:tc>
         <w:tc>
@@ -2195,21 +1928,8 @@
             <w:tcW w:w="1807" w:type="dxa"/>
           </w:tcPr>
           <w:p>
-            <w:proofErr w:type="spellStart"/>
-            <w:r>
-              <w:t>integer</w:t>
-            </w:r>
-            <w:proofErr w:type="spellEnd"/>
-            <w:r>
-              <w:t xml:space="preserve"> (1–6, </w:t>
-            </w:r>
-            <w:proofErr w:type="spellStart"/>
-            <w:r>
-              <w:t>ordinalní</w:t>
-            </w:r>
-            <w:proofErr w:type="spellEnd"/>
-            <w:r>
-              <w:t>)</w:t>
+            <w:r>
+              <w:t>integer (1–6, ordinalní)</w:t>
             </w:r>
           </w:p>
         </w:tc>
@@ -2240,21 +1960,8 @@
             <w:tcW w:w="1807" w:type="dxa"/>
           </w:tcPr>
           <w:p>
-            <w:proofErr w:type="spellStart"/>
-            <w:r>
-              <w:t>integer</w:t>
-            </w:r>
-            <w:proofErr w:type="spellEnd"/>
-            <w:r>
-              <w:t xml:space="preserve"> (1–6, </w:t>
-            </w:r>
-            <w:proofErr w:type="spellStart"/>
-            <w:r>
-              <w:t>ordinalní</w:t>
-            </w:r>
-            <w:proofErr w:type="spellEnd"/>
-            <w:r>
-              <w:t>)</w:t>
+            <w:r>
+              <w:t>integer (1–6, ordinalní)</w:t>
             </w:r>
           </w:p>
         </w:tc>
@@ -2286,21 +1993,8 @@
             <w:tcW w:w="1807" w:type="dxa"/>
           </w:tcPr>
           <w:p>
-            <w:proofErr w:type="spellStart"/>
-            <w:r>
-              <w:t>integer</w:t>
-            </w:r>
-            <w:proofErr w:type="spellEnd"/>
-            <w:r>
-              <w:t xml:space="preserve"> (1–6, </w:t>
-            </w:r>
-            <w:proofErr w:type="spellStart"/>
-            <w:r>
-              <w:t>ordinalní</w:t>
-            </w:r>
-            <w:proofErr w:type="spellEnd"/>
-            <w:r>
-              <w:t>)</w:t>
+            <w:r>
+              <w:t>integer (1–6, ordinalní)</w:t>
             </w:r>
           </w:p>
         </w:tc>
@@ -2311,11 +2005,9 @@
             <w:tcW w:w="4530" w:type="dxa"/>
           </w:tcPr>
           <w:p>
-            <w:proofErr w:type="spellStart"/>
             <w:r>
               <w:t>recommendation_metrics_co_index</w:t>
             </w:r>
-            <w:proofErr w:type="spellEnd"/>
           </w:p>
         </w:tc>
         <w:tc>
@@ -2333,21 +2025,8 @@
             <w:tcW w:w="1807" w:type="dxa"/>
           </w:tcPr>
           <w:p>
-            <w:proofErr w:type="spellStart"/>
-            <w:r>
-              <w:t>integer</w:t>
-            </w:r>
-            <w:proofErr w:type="spellEnd"/>
-            <w:r>
-              <w:t xml:space="preserve"> (1–6, </w:t>
-            </w:r>
-            <w:proofErr w:type="spellStart"/>
-            <w:r>
-              <w:t>ordinalní</w:t>
-            </w:r>
-            <w:proofErr w:type="spellEnd"/>
-            <w:r>
-              <w:t>)</w:t>
+            <w:r>
+              <w:t>integer (1–6, ordinalní)</w:t>
             </w:r>
           </w:p>
         </w:tc>
@@ -2378,21 +2057,8 @@
             <w:tcW w:w="1807" w:type="dxa"/>
           </w:tcPr>
           <w:p>
-            <w:proofErr w:type="spellStart"/>
-            <w:r>
-              <w:t>integer</w:t>
-            </w:r>
-            <w:proofErr w:type="spellEnd"/>
-            <w:r>
-              <w:t xml:space="preserve"> (1–6, </w:t>
-            </w:r>
-            <w:proofErr w:type="spellStart"/>
-            <w:r>
-              <w:t>ordinalní</w:t>
-            </w:r>
-            <w:proofErr w:type="spellEnd"/>
-            <w:r>
-              <w:t>)</w:t>
+            <w:r>
+              <w:t>integer (1–6, ordinalní)</w:t>
             </w:r>
           </w:p>
         </w:tc>
@@ -2423,21 +2089,8 @@
             <w:tcW w:w="1807" w:type="dxa"/>
           </w:tcPr>
           <w:p>
-            <w:proofErr w:type="spellStart"/>
-            <w:r>
-              <w:t>integer</w:t>
-            </w:r>
-            <w:proofErr w:type="spellEnd"/>
-            <w:r>
-              <w:t xml:space="preserve"> (1–6, </w:t>
-            </w:r>
-            <w:proofErr w:type="spellStart"/>
-            <w:r>
-              <w:t>ordinalní</w:t>
-            </w:r>
-            <w:proofErr w:type="spellEnd"/>
-            <w:r>
-              <w:t>)</w:t>
+            <w:r>
+              <w:t>integer (1–6, ordinalní)</w:t>
             </w:r>
           </w:p>
         </w:tc>
@@ -2468,21 +2121,8 @@
             <w:tcW w:w="1807" w:type="dxa"/>
           </w:tcPr>
           <w:p>
-            <w:proofErr w:type="spellStart"/>
-            <w:r>
-              <w:t>integer</w:t>
-            </w:r>
-            <w:proofErr w:type="spellEnd"/>
-            <w:r>
-              <w:t xml:space="preserve"> (1–6, </w:t>
-            </w:r>
-            <w:proofErr w:type="spellStart"/>
-            <w:r>
-              <w:t>ordinalní</w:t>
-            </w:r>
-            <w:proofErr w:type="spellEnd"/>
-            <w:r>
-              <w:t>)</w:t>
+            <w:r>
+              <w:t>integer (1–6, ordinalní)</w:t>
             </w:r>
           </w:p>
         </w:tc>
@@ -2564,13 +2204,8 @@
             <w:tcW w:w="2880" w:type="dxa"/>
           </w:tcPr>
           <w:p>
-            <w:proofErr w:type="spellStart"/>
-            <w:r>
-              <w:t>character</w:t>
-            </w:r>
-            <w:proofErr w:type="spellEnd"/>
-            <w:r>
-              <w:t xml:space="preserve"> (identifikátor měření)</w:t>
+            <w:r>
+              <w:t>character (identifikátor měření)</w:t>
             </w:r>
           </w:p>
         </w:tc>
@@ -2581,11 +2216,9 @@
             <w:tcW w:w="2880" w:type="dxa"/>
           </w:tcPr>
           <w:p>
-            <w:proofErr w:type="spellStart"/>
             <w:r>
               <w:t>date</w:t>
             </w:r>
-            <w:proofErr w:type="spellEnd"/>
           </w:p>
         </w:tc>
         <w:tc>
@@ -2603,21 +2236,8 @@
             <w:tcW w:w="2880" w:type="dxa"/>
           </w:tcPr>
           <w:p>
-            <w:proofErr w:type="spellStart"/>
-            <w:r>
-              <w:t>character</w:t>
-            </w:r>
-            <w:proofErr w:type="spellEnd"/>
-            <w:r>
-              <w:t xml:space="preserve"> (časový údaj, převede se na </w:t>
-            </w:r>
-            <w:proofErr w:type="spellStart"/>
-            <w:r>
-              <w:t>POSIXct</w:t>
-            </w:r>
-            <w:proofErr w:type="spellEnd"/>
-            <w:r>
-              <w:t>)</w:t>
+            <w:r>
+              <w:t>character (časový údaj, převede se na POSIXct)</w:t>
             </w:r>
           </w:p>
         </w:tc>
@@ -2628,11 +2248,9 @@
             <w:tcW w:w="2880" w:type="dxa"/>
           </w:tcPr>
           <w:p>
-            <w:proofErr w:type="spellStart"/>
             <w:r>
               <w:t>sensor_id</w:t>
             </w:r>
-            <w:proofErr w:type="spellEnd"/>
           </w:p>
         </w:tc>
         <w:tc>
@@ -2650,13 +2268,8 @@
             <w:tcW w:w="2880" w:type="dxa"/>
           </w:tcPr>
           <w:p>
-            <w:proofErr w:type="spellStart"/>
-            <w:r>
-              <w:t>integer</w:t>
-            </w:r>
-            <w:proofErr w:type="spellEnd"/>
-            <w:r>
-              <w:t xml:space="preserve"> (ID senzoru)</w:t>
+            <w:r>
+              <w:t>integer (ID senzoru)</w:t>
             </w:r>
           </w:p>
         </w:tc>
@@ -2687,13 +2300,8 @@
             <w:tcW w:w="2880" w:type="dxa"/>
           </w:tcPr>
           <w:p>
-            <w:proofErr w:type="spellStart"/>
-            <w:r>
-              <w:t>numeric</w:t>
-            </w:r>
-            <w:proofErr w:type="spellEnd"/>
-            <w:r>
-              <w:t xml:space="preserve"> (spojitá, teplota vzduchu)</w:t>
+            <w:r>
+              <w:t>numeric (spojitá, teplota vzduchu)</w:t>
             </w:r>
           </w:p>
         </w:tc>
@@ -2724,13 +2332,8 @@
             <w:tcW w:w="2880" w:type="dxa"/>
           </w:tcPr>
           <w:p>
-            <w:proofErr w:type="spellStart"/>
-            <w:r>
-              <w:t>numeric</w:t>
-            </w:r>
-            <w:proofErr w:type="spellEnd"/>
-            <w:r>
-              <w:t xml:space="preserve"> (spojitá, relativní vlhkost)</w:t>
+            <w:r>
+              <w:t>numeric (spojitá, relativní vlhkost)</w:t>
             </w:r>
           </w:p>
         </w:tc>
@@ -2741,11 +2344,9 @@
             <w:tcW w:w="2880" w:type="dxa"/>
           </w:tcPr>
           <w:p>
-            <w:proofErr w:type="spellStart"/>
             <w:r>
               <w:t>data_pressure</w:t>
             </w:r>
-            <w:proofErr w:type="spellEnd"/>
           </w:p>
         </w:tc>
         <w:tc>
@@ -2763,13 +2364,8 @@
             <w:tcW w:w="2880" w:type="dxa"/>
           </w:tcPr>
           <w:p>
-            <w:proofErr w:type="spellStart"/>
-            <w:r>
-              <w:t>numeric</w:t>
-            </w:r>
-            <w:proofErr w:type="spellEnd"/>
-            <w:r>
-              <w:t xml:space="preserve"> (spojitá, atmosférický tlak)</w:t>
+            <w:r>
+              <w:t>numeric (spojitá, atmosférický tlak)</w:t>
             </w:r>
           </w:p>
         </w:tc>
@@ -2780,11 +2376,9 @@
             <w:tcW w:w="2880" w:type="dxa"/>
           </w:tcPr>
           <w:p>
-            <w:proofErr w:type="spellStart"/>
             <w:r>
               <w:t>data_windDir</w:t>
             </w:r>
-            <w:proofErr w:type="spellEnd"/>
           </w:p>
         </w:tc>
         <w:tc>
@@ -2802,13 +2396,8 @@
             <w:tcW w:w="2880" w:type="dxa"/>
           </w:tcPr>
           <w:p>
-            <w:proofErr w:type="spellStart"/>
-            <w:r>
-              <w:t>character</w:t>
-            </w:r>
-            <w:proofErr w:type="spellEnd"/>
-            <w:r>
-              <w:t xml:space="preserve"> (kategorická, směr větru)</w:t>
+            <w:r>
+              <w:t>character (kategorická, směr větru)</w:t>
             </w:r>
           </w:p>
         </w:tc>
@@ -2819,11 +2408,9 @@
             <w:tcW w:w="2880" w:type="dxa"/>
           </w:tcPr>
           <w:p>
-            <w:proofErr w:type="spellStart"/>
             <w:r>
               <w:t>data_windSpeed</w:t>
             </w:r>
-            <w:proofErr w:type="spellEnd"/>
           </w:p>
         </w:tc>
         <w:tc>
@@ -2841,13 +2428,8 @@
             <w:tcW w:w="2880" w:type="dxa"/>
           </w:tcPr>
           <w:p>
-            <w:proofErr w:type="spellStart"/>
-            <w:r>
-              <w:t>numeric</w:t>
-            </w:r>
-            <w:proofErr w:type="spellEnd"/>
-            <w:r>
-              <w:t xml:space="preserve"> (spojitá, rychlost větru)</w:t>
+            <w:r>
+              <w:t>numeric (spojitá, rychlost větru)</w:t>
             </w:r>
           </w:p>
         </w:tc>
@@ -2858,11 +2440,9 @@
             <w:tcW w:w="2880" w:type="dxa"/>
           </w:tcPr>
           <w:p>
-            <w:proofErr w:type="spellStart"/>
             <w:r>
               <w:t>data_windImpact</w:t>
             </w:r>
-            <w:proofErr w:type="spellEnd"/>
           </w:p>
         </w:tc>
         <w:tc>
@@ -2880,13 +2460,8 @@
             <w:tcW w:w="2880" w:type="dxa"/>
           </w:tcPr>
           <w:p>
-            <w:proofErr w:type="spellStart"/>
-            <w:r>
-              <w:t>numeric</w:t>
-            </w:r>
-            <w:proofErr w:type="spellEnd"/>
-            <w:r>
-              <w:t xml:space="preserve"> (spojitá, síla větru)</w:t>
+            <w:r>
+              <w:t>numeric (spojitá, síla větru)</w:t>
             </w:r>
           </w:p>
         </w:tc>
@@ -2897,11 +2472,9 @@
             <w:tcW w:w="2880" w:type="dxa"/>
           </w:tcPr>
           <w:p>
-            <w:proofErr w:type="spellStart"/>
             <w:r>
               <w:t>data_volumeMm</w:t>
             </w:r>
-            <w:proofErr w:type="spellEnd"/>
           </w:p>
         </w:tc>
         <w:tc>
@@ -2919,13 +2492,8 @@
             <w:tcW w:w="2880" w:type="dxa"/>
           </w:tcPr>
           <w:p>
-            <w:proofErr w:type="spellStart"/>
-            <w:r>
-              <w:t>numeric</w:t>
-            </w:r>
-            <w:proofErr w:type="spellEnd"/>
-            <w:r>
-              <w:t xml:space="preserve"> (spojitá, srážky za hodinu)</w:t>
+            <w:r>
+              <w:t>numeric (spojitá, srážky za hodinu)</w:t>
             </w:r>
           </w:p>
         </w:tc>
@@ -2936,12 +2504,10 @@
             <w:tcW w:w="2880" w:type="dxa"/>
           </w:tcPr>
           <w:p>
-            <w:proofErr w:type="spellStart"/>
             <w:r>
               <w:lastRenderedPageBreak/>
               <w:t>data_leafWetness</w:t>
             </w:r>
-            <w:proofErr w:type="spellEnd"/>
           </w:p>
         </w:tc>
         <w:tc>
@@ -2959,13 +2525,8 @@
             <w:tcW w:w="2880" w:type="dxa"/>
           </w:tcPr>
           <w:p>
-            <w:proofErr w:type="spellStart"/>
-            <w:r>
-              <w:t>logical</w:t>
-            </w:r>
-            <w:proofErr w:type="spellEnd"/>
-            <w:r>
-              <w:t xml:space="preserve"> (všude NA – nebude dále použito)</w:t>
+            <w:r>
+              <w:t>logical (všude NA – nebude dále použito)</w:t>
             </w:r>
           </w:p>
         </w:tc>
@@ -2998,15 +2559,7 @@
         <w:pStyle w:val="Nadpis3"/>
       </w:pPr>
       <w:r>
-        <w:t xml:space="preserve">Ovzduší (soubor </w:t>
-      </w:r>
-      <w:proofErr w:type="spellStart"/>
-      <w:r>
-        <w:t>pm</w:t>
-      </w:r>
-      <w:proofErr w:type="spellEnd"/>
-      <w:r>
-        <w:t xml:space="preserve"> – za celý rok)</w:t>
+        <w:t>Ovzduší (soubor pm – za celý rok)</w:t>
       </w:r>
     </w:p>
     <w:p>
@@ -3093,31 +2646,7 @@
       </w:r>
       <w:r>
         <w:br/>
-        <w:t xml:space="preserve">Průměrná hodnota činí 8,69 µg/m³, přičemž medián je 4 µg/m³. Hodnoty se pohybují v rozsahu 0 až 746 µg/m³. Rozložení dat je silně </w:t>
-      </w:r>
-      <w:proofErr w:type="spellStart"/>
-      <w:r>
-        <w:t>pravostranně</w:t>
-      </w:r>
-      <w:proofErr w:type="spellEnd"/>
-      <w:r>
-        <w:t xml:space="preserve"> šikmé (</w:t>
-      </w:r>
-      <w:proofErr w:type="spellStart"/>
-      <w:r>
-        <w:t>skewness</w:t>
-      </w:r>
-      <w:proofErr w:type="spellEnd"/>
-      <w:r>
-        <w:t xml:space="preserve"> = 15,90) a vykazuje vysokou špičatost (</w:t>
-      </w:r>
-      <w:proofErr w:type="spellStart"/>
-      <w:r>
-        <w:t>kurtosis</w:t>
-      </w:r>
-      <w:proofErr w:type="spellEnd"/>
-      <w:r>
-        <w:t xml:space="preserve"> = 386,15), což značí výskyt extrémních hodnot.</w:t>
+        <w:t>Průměrná hodnota činí 8,69 µg/m³, přičemž medián je 4 µg/m³. Hodnoty se pohybují v rozsahu 0 až 746 µg/m³. Rozložení dat je silně pravostranně šikmé (skewness = 15,90) a vykazuje vysokou špičatost (kurtosis = 386,15), což značí výskyt extrémních hodnot.</w:t>
       </w:r>
     </w:p>
     <w:p>
@@ -3136,31 +2665,7 @@
       </w:r>
       <w:r>
         <w:br/>
-        <w:t xml:space="preserve">Průměrná koncentrace byla 12,13 µg/m³, s mediánem 6 µg/m³. Maximální naměřená hodnota dosahuje až 950 µg/m³. Data jsou rovněž značně </w:t>
-      </w:r>
-      <w:proofErr w:type="spellStart"/>
-      <w:r>
-        <w:t>pravostranně</w:t>
-      </w:r>
-      <w:proofErr w:type="spellEnd"/>
-      <w:r>
-        <w:t xml:space="preserve"> šikmá (</w:t>
-      </w:r>
-      <w:proofErr w:type="spellStart"/>
-      <w:r>
-        <w:t>skewness</w:t>
-      </w:r>
-      <w:proofErr w:type="spellEnd"/>
-      <w:r>
-        <w:t xml:space="preserve"> = 15,27) a s extrémními výkyvy (</w:t>
-      </w:r>
-      <w:proofErr w:type="spellStart"/>
-      <w:r>
-        <w:t>kurtosis</w:t>
-      </w:r>
-      <w:proofErr w:type="spellEnd"/>
-      <w:r>
-        <w:t xml:space="preserve"> = 364,23).</w:t>
+        <w:t>Průměrná koncentrace byla 12,13 µg/m³, s mediánem 6 µg/m³. Maximální naměřená hodnota dosahuje až 950 µg/m³. Data jsou rovněž značně pravostranně šikmá (skewness = 15,27) a s extrémními výkyvy (kurtosis = 364,23).</w:t>
       </w:r>
     </w:p>
     <w:p>
@@ -3179,23 +2684,7 @@
       </w:r>
       <w:r>
         <w:br/>
-        <w:t>Průměr 13,57 µg/m³ a medián 6 µg/m³. Extrémní hodnota dosáhla 1765 µg/m³. Rozdělení je vysoce šikmé (</w:t>
-      </w:r>
-      <w:proofErr w:type="spellStart"/>
-      <w:r>
-        <w:t>skewness</w:t>
-      </w:r>
-      <w:proofErr w:type="spellEnd"/>
-      <w:r>
-        <w:t xml:space="preserve"> = 24,07) a má velmi ostrý vrchol (</w:t>
-      </w:r>
-      <w:proofErr w:type="spellStart"/>
-      <w:r>
-        <w:t>kurtosis</w:t>
-      </w:r>
-      <w:proofErr w:type="spellEnd"/>
-      <w:r>
-        <w:t xml:space="preserve"> = 738,09).</w:t>
+        <w:t>Průměr 13,57 µg/m³ a medián 6 µg/m³. Extrémní hodnota dosáhla 1765 µg/m³. Rozdělení je vysoce šikmé (skewness = 24,07) a má velmi ostrý vrchol (kurtosis = 738,09).</w:t>
       </w:r>
     </w:p>
     <w:p>
@@ -3214,31 +2703,7 @@
       </w:r>
       <w:r>
         <w:br/>
-        <w:t xml:space="preserve">S průměrem 15,47 µg/m³ a mediánem 7 µg/m³ se jedná o frakci s </w:t>
-      </w:r>
-      <w:proofErr w:type="gramStart"/>
-      <w:r>
-        <w:t>nejvyššími maximy</w:t>
-      </w:r>
-      <w:proofErr w:type="gramEnd"/>
-      <w:r>
-        <w:t xml:space="preserve"> – až 1878 µg/m³. Rozložení je extrémně asymetrické (</w:t>
-      </w:r>
-      <w:proofErr w:type="spellStart"/>
-      <w:r>
-        <w:t>skewness</w:t>
-      </w:r>
-      <w:proofErr w:type="spellEnd"/>
-      <w:r>
-        <w:t xml:space="preserve"> = 22,91) s velmi výraznou špičatostí (</w:t>
-      </w:r>
-      <w:proofErr w:type="spellStart"/>
-      <w:r>
-        <w:t>kurtosis</w:t>
-      </w:r>
-      <w:proofErr w:type="spellEnd"/>
-      <w:r>
-        <w:t xml:space="preserve"> = 590,89).</w:t>
+        <w:t>S průměrem 15,47 µg/m³ a mediánem 7 µg/m³ se jedná o frakci s nejvyššími maximy – až 1878 µg/m³. Rozložení je extrémně asymetrické (skewness = 22,91) s velmi výraznou špičatostí (kurtosis = 590,89).</w:t>
       </w:r>
     </w:p>
     <w:p>
@@ -3272,23 +2737,7 @@
       </w:r>
       <w:r>
         <w:br/>
-        <w:t>Průměrná koncentrace byla 14,83 µg/m³, medián 11,95 µg/m³. Maximum dosáhlo 2423 µg/m³, což může naznačovat výskyt odlehlých nebo extrémních hodnot. Rozložení má silnou pravostrannou šikmost (</w:t>
-      </w:r>
-      <w:proofErr w:type="spellStart"/>
-      <w:r>
-        <w:t>skewness</w:t>
-      </w:r>
-      <w:proofErr w:type="spellEnd"/>
-      <w:r>
-        <w:t xml:space="preserve"> = 35,81) a extrémně vysokou špičatost (</w:t>
-      </w:r>
-      <w:proofErr w:type="spellStart"/>
-      <w:r>
-        <w:t>kurtosis</w:t>
-      </w:r>
-      <w:proofErr w:type="spellEnd"/>
-      <w:r>
-        <w:t xml:space="preserve"> = 4303,50).</w:t>
+        <w:t>Průměrná koncentrace byla 14,83 µg/m³, medián 11,95 µg/m³. Maximum dosáhlo 2423 µg/m³, což může naznačovat výskyt odlehlých nebo extrémních hodnot. Rozložení má silnou pravostrannou šikmost (skewness = 35,81) a extrémně vysokou špičatost (kurtosis = 4303,50).</w:t>
       </w:r>
     </w:p>
     <w:p/>
@@ -3466,28 +2915,12 @@
         <w:pStyle w:val="Nadpis3"/>
       </w:pPr>
       <w:r>
-        <w:t>Počasí (</w:t>
-      </w:r>
-      <w:proofErr w:type="spellStart"/>
-      <w:r>
-        <w:t>meteo</w:t>
-      </w:r>
-      <w:proofErr w:type="spellEnd"/>
-      <w:r>
-        <w:t>)</w:t>
-      </w:r>
-    </w:p>
-    <w:p>
-      <w:r>
-        <w:t xml:space="preserve">Soubor </w:t>
-      </w:r>
-      <w:proofErr w:type="spellStart"/>
-      <w:r>
-        <w:t>wind</w:t>
-      </w:r>
-      <w:proofErr w:type="spellEnd"/>
-      <w:r>
-        <w:t xml:space="preserve"> obsahuje meteorologická data měřená v časové řadě od 1. 1. 2024 do </w:t>
+        <w:t>Počasí (meteo)</w:t>
+      </w:r>
+    </w:p>
+    <w:p>
+      <w:r>
+        <w:t xml:space="preserve">Soubor wind obsahuje meteorologická data měřená v časové řadě od 1. 1. 2024 do </w:t>
       </w:r>
       <w:r>
         <w:t>7</w:t>
@@ -3751,11 +3184,43 @@
         <w:t>ě</w:t>
       </w:r>
       <w:r>
+        <w:t xml:space="preserve"> pravostrann</w:t>
+      </w:r>
+      <w:r>
+        <w:rPr>
+          <w:rFonts w:ascii="Aptos" w:hAnsi="Aptos" w:cs="Aptos"/>
+        </w:rPr>
+        <w:t>ě</w:t>
+      </w:r>
+      <w:r>
         <w:t xml:space="preserve"> </w:t>
       </w:r>
-      <w:proofErr w:type="spellStart"/>
-      <w:r>
-        <w:t>pravostrann</w:t>
+      <w:r>
+        <w:rPr>
+          <w:rFonts w:ascii="Aptos" w:hAnsi="Aptos" w:cs="Aptos"/>
+        </w:rPr>
+        <w:t>š</w:t>
+      </w:r>
+      <w:r>
+        <w:t>ikm</w:t>
+      </w:r>
+      <w:r>
+        <w:rPr>
+          <w:rFonts w:ascii="Aptos" w:hAnsi="Aptos" w:cs="Aptos"/>
+        </w:rPr>
+        <w:t>é</w:t>
+      </w:r>
+      <w:r>
+        <w:t xml:space="preserve"> (skewness = 0,40) s ploch</w:t>
+      </w:r>
+      <w:r>
+        <w:rPr>
+          <w:rFonts w:ascii="Aptos" w:hAnsi="Aptos" w:cs="Aptos"/>
+        </w:rPr>
+        <w:t>ý</w:t>
+      </w:r>
+      <w:r>
+        <w:t>m tvarem rozd</w:t>
       </w:r>
       <w:r>
         <w:rPr>
@@ -3763,51 +3228,6 @@
         </w:rPr>
         <w:t>ě</w:t>
       </w:r>
-      <w:proofErr w:type="spellEnd"/>
-      <w:r>
-        <w:t xml:space="preserve"> </w:t>
-      </w:r>
-      <w:r>
-        <w:rPr>
-          <w:rFonts w:ascii="Aptos" w:hAnsi="Aptos" w:cs="Aptos"/>
-        </w:rPr>
-        <w:t>š</w:t>
-      </w:r>
-      <w:r>
-        <w:t>ikm</w:t>
-      </w:r>
-      <w:r>
-        <w:rPr>
-          <w:rFonts w:ascii="Aptos" w:hAnsi="Aptos" w:cs="Aptos"/>
-        </w:rPr>
-        <w:t>é</w:t>
-      </w:r>
-      <w:r>
-        <w:t xml:space="preserve"> (</w:t>
-      </w:r>
-      <w:proofErr w:type="spellStart"/>
-      <w:r>
-        <w:t>skewness</w:t>
-      </w:r>
-      <w:proofErr w:type="spellEnd"/>
-      <w:r>
-        <w:t xml:space="preserve"> = 0,40) s ploch</w:t>
-      </w:r>
-      <w:r>
-        <w:rPr>
-          <w:rFonts w:ascii="Aptos" w:hAnsi="Aptos" w:cs="Aptos"/>
-        </w:rPr>
-        <w:t>ý</w:t>
-      </w:r>
-      <w:r>
-        <w:t>m tvarem rozd</w:t>
-      </w:r>
-      <w:r>
-        <w:rPr>
-          <w:rFonts w:ascii="Aptos" w:hAnsi="Aptos" w:cs="Aptos"/>
-        </w:rPr>
-        <w:t>ě</w:t>
-      </w:r>
       <w:r>
         <w:t>len</w:t>
       </w:r>
@@ -3818,15 +3238,7 @@
         <w:t>í</w:t>
       </w:r>
       <w:r>
-        <w:t xml:space="preserve"> (</w:t>
-      </w:r>
-      <w:proofErr w:type="spellStart"/>
-      <w:r>
-        <w:t>kurtosis</w:t>
-      </w:r>
-      <w:proofErr w:type="spellEnd"/>
-      <w:r>
-        <w:t xml:space="preserve"> = </w:t>
+        <w:t xml:space="preserve"> (kurtosis = </w:t>
       </w:r>
       <w:r>
         <w:rPr>
@@ -4051,22 +3463,17 @@
         <w:t>ě</w:t>
       </w:r>
       <w:r>
+        <w:t xml:space="preserve"> levostrann</w:t>
+      </w:r>
+      <w:r>
+        <w:rPr>
+          <w:rFonts w:ascii="Aptos" w:hAnsi="Aptos" w:cs="Aptos"/>
+        </w:rPr>
+        <w:t>ě</w:t>
+      </w:r>
+      <w:r>
         <w:t xml:space="preserve"> </w:t>
       </w:r>
-      <w:proofErr w:type="spellStart"/>
-      <w:r>
-        <w:t>levostrann</w:t>
-      </w:r>
-      <w:r>
-        <w:rPr>
-          <w:rFonts w:ascii="Aptos" w:hAnsi="Aptos" w:cs="Aptos"/>
-        </w:rPr>
-        <w:t>ě</w:t>
-      </w:r>
-      <w:proofErr w:type="spellEnd"/>
-      <w:r>
-        <w:t xml:space="preserve"> </w:t>
-      </w:r>
       <w:r>
         <w:rPr>
           <w:rFonts w:ascii="Aptos" w:hAnsi="Aptos" w:cs="Aptos"/>
@@ -4083,15 +3490,7 @@
         <w:t>é</w:t>
       </w:r>
       <w:r>
-        <w:t xml:space="preserve"> (</w:t>
-      </w:r>
-      <w:proofErr w:type="spellStart"/>
-      <w:r>
-        <w:t>skewness</w:t>
-      </w:r>
-      <w:proofErr w:type="spellEnd"/>
-      <w:r>
-        <w:t xml:space="preserve"> = </w:t>
+        <w:t xml:space="preserve"> (skewness = </w:t>
       </w:r>
       <w:r>
         <w:rPr>
@@ -4196,23 +3595,7 @@
           <w:b/>
           <w:bCs/>
         </w:rPr>
-        <w:t>Atmosférický tlak (</w:t>
-      </w:r>
-      <w:proofErr w:type="spellStart"/>
-      <w:r>
-        <w:rPr>
-          <w:b/>
-          <w:bCs/>
-        </w:rPr>
-        <w:t>data_pressure</w:t>
-      </w:r>
-      <w:proofErr w:type="spellEnd"/>
-      <w:r>
-        <w:rPr>
-          <w:b/>
-          <w:bCs/>
-        </w:rPr>
-        <w:t>)</w:t>
+        <w:t>Atmosférický tlak (data_pressure)</w:t>
       </w:r>
     </w:p>
     <w:p>
@@ -4314,15 +3697,7 @@
         <w:t>í</w:t>
       </w:r>
       <w:r>
-        <w:t xml:space="preserve"> (</w:t>
-      </w:r>
-      <w:proofErr w:type="spellStart"/>
-      <w:r>
-        <w:t>skewness</w:t>
-      </w:r>
-      <w:proofErr w:type="spellEnd"/>
-      <w:r>
-        <w:t xml:space="preserve"> = 0,13). Rozptyl je v</w:t>
+        <w:t xml:space="preserve"> (skewness = 0,13). Rozptyl je v</w:t>
       </w:r>
       <w:r>
         <w:rPr>
@@ -4491,23 +3866,214 @@
           <w:bCs/>
         </w:rPr>
         <w:lastRenderedPageBreak/>
-        <w:t>Rychlost větru (</w:t>
-      </w:r>
-      <w:proofErr w:type="spellStart"/>
-      <w:r>
+        <w:t>Rychlost větru (data_windSpeed)</w:t>
+      </w:r>
+    </w:p>
+    <w:p>
+      <w:pPr>
+        <w:pStyle w:val="Odstavecseseznamem"/>
+        <w:numPr>
+          <w:ilvl w:val="0"/>
+          <w:numId w:val="1"/>
+        </w:numPr>
+      </w:pPr>
+      <w:r>
+        <w:t>Průměrná rychlost větru činí 2,54</w:t>
+      </w:r>
+      <w:r>
+        <w:rPr>
+          <w:rFonts w:ascii="Arial" w:hAnsi="Arial" w:cs="Arial"/>
+        </w:rPr>
+        <w:t> </w:t>
+      </w:r>
+      <w:r>
+        <w:t>m/s, medi</w:t>
+      </w:r>
+      <w:r>
+        <w:rPr>
+          <w:rFonts w:ascii="Aptos" w:hAnsi="Aptos" w:cs="Aptos"/>
+        </w:rPr>
+        <w:t>á</w:t>
+      </w:r>
+      <w:r>
+        <w:t>n je 1,96</w:t>
+      </w:r>
+      <w:r>
+        <w:rPr>
+          <w:rFonts w:ascii="Arial" w:hAnsi="Arial" w:cs="Arial"/>
+        </w:rPr>
+        <w:t> </w:t>
+      </w:r>
+      <w:r>
+        <w:t>m/s. Maximum je 17,09</w:t>
+      </w:r>
+      <w:r>
+        <w:rPr>
+          <w:rFonts w:ascii="Arial" w:hAnsi="Arial" w:cs="Arial"/>
+        </w:rPr>
+        <w:t> </w:t>
+      </w:r>
+      <w:r>
+        <w:t>m/s. Rozlo</w:t>
+      </w:r>
+      <w:r>
+        <w:rPr>
+          <w:rFonts w:ascii="Aptos" w:hAnsi="Aptos" w:cs="Aptos"/>
+        </w:rPr>
+        <w:t>ž</w:t>
+      </w:r>
+      <w:r>
+        <w:t>en</w:t>
+      </w:r>
+      <w:r>
+        <w:rPr>
+          <w:rFonts w:ascii="Aptos" w:hAnsi="Aptos" w:cs="Aptos"/>
+        </w:rPr>
+        <w:t>í</w:t>
+      </w:r>
+      <w:r>
+        <w:t xml:space="preserve"> je pravostrann</w:t>
+      </w:r>
+      <w:r>
+        <w:rPr>
+          <w:rFonts w:ascii="Aptos" w:hAnsi="Aptos" w:cs="Aptos"/>
+        </w:rPr>
+        <w:t>ě</w:t>
+      </w:r>
+      <w:r>
+        <w:t xml:space="preserve"> </w:t>
+      </w:r>
+      <w:r>
+        <w:rPr>
+          <w:rFonts w:ascii="Aptos" w:hAnsi="Aptos" w:cs="Aptos"/>
+        </w:rPr>
+        <w:t>š</w:t>
+      </w:r>
+      <w:r>
+        <w:t>ikm</w:t>
+      </w:r>
+      <w:r>
+        <w:rPr>
+          <w:rFonts w:ascii="Aptos" w:hAnsi="Aptos" w:cs="Aptos"/>
+        </w:rPr>
+        <w:t>é</w:t>
+      </w:r>
+      <w:r>
+        <w:t xml:space="preserve"> (skewness = 1,34) </w:t>
+      </w:r>
+      <w:r>
+        <w:rPr>
+          <w:rFonts w:ascii="Aptos" w:hAnsi="Aptos" w:cs="Aptos"/>
+        </w:rPr>
+        <w:t>–</w:t>
+      </w:r>
+      <w:r>
+        <w:t xml:space="preserve"> v</w:t>
+      </w:r>
+      <w:r>
+        <w:rPr>
+          <w:rFonts w:ascii="Aptos" w:hAnsi="Aptos" w:cs="Aptos"/>
+        </w:rPr>
+        <w:t>ě</w:t>
+      </w:r>
+      <w:r>
+        <w:t>t</w:t>
+      </w:r>
+      <w:r>
+        <w:rPr>
+          <w:rFonts w:ascii="Aptos" w:hAnsi="Aptos" w:cs="Aptos"/>
+        </w:rPr>
+        <w:t>š</w:t>
+      </w:r>
+      <w:r>
+        <w:t>ina hodnot je n</w:t>
+      </w:r>
+      <w:r>
+        <w:rPr>
+          <w:rFonts w:ascii="Aptos" w:hAnsi="Aptos" w:cs="Aptos"/>
+        </w:rPr>
+        <w:t>í</w:t>
+      </w:r>
+      <w:r>
+        <w:t>zk</w:t>
+      </w:r>
+      <w:r>
+        <w:rPr>
+          <w:rFonts w:ascii="Aptos" w:hAnsi="Aptos" w:cs="Aptos"/>
+        </w:rPr>
+        <w:t>á</w:t>
+      </w:r>
+      <w:r>
+        <w:t>, ale ob</w:t>
+      </w:r>
+      <w:r>
+        <w:rPr>
+          <w:rFonts w:ascii="Aptos" w:hAnsi="Aptos" w:cs="Aptos"/>
+        </w:rPr>
+        <w:t>č</w:t>
+      </w:r>
+      <w:r>
+        <w:t>as se objevuj</w:t>
+      </w:r>
+      <w:r>
+        <w:rPr>
+          <w:rFonts w:ascii="Aptos" w:hAnsi="Aptos" w:cs="Aptos"/>
+        </w:rPr>
+        <w:t>í</w:t>
+      </w:r>
+      <w:r>
+        <w:t xml:space="preserve"> extr</w:t>
+      </w:r>
+      <w:r>
+        <w:rPr>
+          <w:rFonts w:ascii="Aptos" w:hAnsi="Aptos" w:cs="Aptos"/>
+        </w:rPr>
+        <w:t>é</w:t>
+      </w:r>
+      <w:r>
+        <w:t>mn</w:t>
+      </w:r>
+      <w:r>
+        <w:rPr>
+          <w:rFonts w:ascii="Aptos" w:hAnsi="Aptos" w:cs="Aptos"/>
+        </w:rPr>
+        <w:t>ě</w:t>
+      </w:r>
+      <w:r>
+        <w:t>j</w:t>
+      </w:r>
+      <w:r>
+        <w:rPr>
+          <w:rFonts w:ascii="Aptos" w:hAnsi="Aptos" w:cs="Aptos"/>
+        </w:rPr>
+        <w:t>ší</w:t>
+      </w:r>
+      <w:r>
+        <w:t xml:space="preserve"> n</w:t>
+      </w:r>
+      <w:r>
+        <w:rPr>
+          <w:rFonts w:ascii="Aptos" w:hAnsi="Aptos" w:cs="Aptos"/>
+        </w:rPr>
+        <w:t>á</w:t>
+      </w:r>
+      <w:r>
+        <w:t>razy.</w:t>
+      </w:r>
+    </w:p>
+    <w:p>
+      <w:pPr>
         <w:rPr>
           <w:b/>
           <w:bCs/>
         </w:rPr>
-        <w:t>data_windSpeed</w:t>
-      </w:r>
-      <w:proofErr w:type="spellEnd"/>
+      </w:pPr>
       <w:r>
         <w:rPr>
           <w:b/>
           <w:bCs/>
         </w:rPr>
-        <w:t>)</w:t>
+        <w:t>Síla větru (data_windImpact)</w:t>
       </w:r>
     </w:p>
     <w:p>
@@ -4519,200 +4085,7 @@
         </w:numPr>
       </w:pPr>
       <w:r>
-        <w:t>Průměrná rychlost větru činí 2,54</w:t>
-      </w:r>
-      <w:r>
-        <w:rPr>
-          <w:rFonts w:ascii="Arial" w:hAnsi="Arial" w:cs="Arial"/>
-        </w:rPr>
-        <w:t> </w:t>
-      </w:r>
-      <w:r>
-        <w:t>m/s, medi</w:t>
-      </w:r>
-      <w:r>
-        <w:rPr>
-          <w:rFonts w:ascii="Aptos" w:hAnsi="Aptos" w:cs="Aptos"/>
-        </w:rPr>
-        <w:t>á</w:t>
-      </w:r>
-      <w:r>
-        <w:t>n je 1,96</w:t>
-      </w:r>
-      <w:r>
-        <w:rPr>
-          <w:rFonts w:ascii="Arial" w:hAnsi="Arial" w:cs="Arial"/>
-        </w:rPr>
-        <w:t> </w:t>
-      </w:r>
-      <w:r>
-        <w:t>m/s. Maximum je 17,09</w:t>
-      </w:r>
-      <w:r>
-        <w:rPr>
-          <w:rFonts w:ascii="Arial" w:hAnsi="Arial" w:cs="Arial"/>
-        </w:rPr>
-        <w:t> </w:t>
-      </w:r>
-      <w:r>
-        <w:t>m/s. Rozlo</w:t>
-      </w:r>
-      <w:r>
-        <w:rPr>
-          <w:rFonts w:ascii="Aptos" w:hAnsi="Aptos" w:cs="Aptos"/>
-        </w:rPr>
-        <w:t>ž</w:t>
-      </w:r>
-      <w:r>
-        <w:t>en</w:t>
-      </w:r>
-      <w:r>
-        <w:rPr>
-          <w:rFonts w:ascii="Aptos" w:hAnsi="Aptos" w:cs="Aptos"/>
-        </w:rPr>
-        <w:t>í</w:t>
-      </w:r>
-      <w:r>
-        <w:t xml:space="preserve"> je </w:t>
-      </w:r>
-      <w:proofErr w:type="spellStart"/>
-      <w:r>
-        <w:t>pravostrann</w:t>
-      </w:r>
-      <w:r>
-        <w:rPr>
-          <w:rFonts w:ascii="Aptos" w:hAnsi="Aptos" w:cs="Aptos"/>
-        </w:rPr>
-        <w:t>ě</w:t>
-      </w:r>
-      <w:proofErr w:type="spellEnd"/>
-      <w:r>
-        <w:t xml:space="preserve"> </w:t>
-      </w:r>
-      <w:r>
-        <w:rPr>
-          <w:rFonts w:ascii="Aptos" w:hAnsi="Aptos" w:cs="Aptos"/>
-        </w:rPr>
-        <w:t>š</w:t>
-      </w:r>
-      <w:r>
-        <w:t>ikm</w:t>
-      </w:r>
-      <w:r>
-        <w:rPr>
-          <w:rFonts w:ascii="Aptos" w:hAnsi="Aptos" w:cs="Aptos"/>
-        </w:rPr>
-        <w:t>é</w:t>
-      </w:r>
-      <w:r>
-        <w:t xml:space="preserve"> (</w:t>
-      </w:r>
-      <w:proofErr w:type="spellStart"/>
-      <w:r>
-        <w:t>skewness</w:t>
-      </w:r>
-      <w:proofErr w:type="spellEnd"/>
-      <w:r>
-        <w:t xml:space="preserve"> = 1,34) </w:t>
-      </w:r>
-      <w:r>
-        <w:rPr>
-          <w:rFonts w:ascii="Aptos" w:hAnsi="Aptos" w:cs="Aptos"/>
-        </w:rPr>
-        <w:t>–</w:t>
-      </w:r>
-      <w:r>
-        <w:t xml:space="preserve"> v</w:t>
-      </w:r>
-      <w:r>
-        <w:rPr>
-          <w:rFonts w:ascii="Aptos" w:hAnsi="Aptos" w:cs="Aptos"/>
-        </w:rPr>
-        <w:t>ě</w:t>
-      </w:r>
-      <w:r>
-        <w:t>t</w:t>
-      </w:r>
-      <w:r>
-        <w:rPr>
-          <w:rFonts w:ascii="Aptos" w:hAnsi="Aptos" w:cs="Aptos"/>
-        </w:rPr>
-        <w:t>š</w:t>
-      </w:r>
-      <w:r>
-        <w:t>ina hodnot je n</w:t>
-      </w:r>
-      <w:r>
-        <w:rPr>
-          <w:rFonts w:ascii="Aptos" w:hAnsi="Aptos" w:cs="Aptos"/>
-        </w:rPr>
-        <w:t>í</w:t>
-      </w:r>
-      <w:r>
-        <w:t>zk</w:t>
-      </w:r>
-      <w:r>
-        <w:rPr>
-          <w:rFonts w:ascii="Aptos" w:hAnsi="Aptos" w:cs="Aptos"/>
-        </w:rPr>
-        <w:t>á</w:t>
-      </w:r>
-      <w:r>
-        <w:t>, ale ob</w:t>
-      </w:r>
-      <w:r>
-        <w:rPr>
-          <w:rFonts w:ascii="Aptos" w:hAnsi="Aptos" w:cs="Aptos"/>
-        </w:rPr>
-        <w:t>č</w:t>
-      </w:r>
-      <w:r>
-        <w:t>as se objevuj</w:t>
-      </w:r>
-      <w:r>
-        <w:rPr>
-          <w:rFonts w:ascii="Aptos" w:hAnsi="Aptos" w:cs="Aptos"/>
-        </w:rPr>
-        <w:t>í</w:t>
-      </w:r>
-      <w:r>
-        <w:t xml:space="preserve"> extr</w:t>
-      </w:r>
-      <w:r>
-        <w:rPr>
-          <w:rFonts w:ascii="Aptos" w:hAnsi="Aptos" w:cs="Aptos"/>
-        </w:rPr>
-        <w:t>é</w:t>
-      </w:r>
-      <w:r>
-        <w:t>mn</w:t>
-      </w:r>
-      <w:r>
-        <w:rPr>
-          <w:rFonts w:ascii="Aptos" w:hAnsi="Aptos" w:cs="Aptos"/>
-        </w:rPr>
-        <w:t>ě</w:t>
-      </w:r>
-      <w:r>
-        <w:t>j</w:t>
-      </w:r>
-      <w:r>
-        <w:rPr>
-          <w:rFonts w:ascii="Aptos" w:hAnsi="Aptos" w:cs="Aptos"/>
-        </w:rPr>
-        <w:t>ší</w:t>
-      </w:r>
-      <w:r>
-        <w:t xml:space="preserve"> n</w:t>
-      </w:r>
-      <w:r>
-        <w:rPr>
-          <w:rFonts w:ascii="Aptos" w:hAnsi="Aptos" w:cs="Aptos"/>
-        </w:rPr>
-        <w:t>á</w:t>
-      </w:r>
-      <w:r>
-        <w:t>razy.</w:t>
+        <w:t>Síla větru (pravděpodobně kombinace směru a rychlosti) má průměr 7,45, medián 5,76. Hodnoty se pohybují mezi 0 a 45,6. Také zde je rozdělení šikmé doprava (skewness = 1,44), což může ukazovat na občasné silnější vlivy větru.</w:t>
       </w:r>
     </w:p>
     <w:p>
@@ -4727,389 +4100,306 @@
           <w:b/>
           <w:bCs/>
         </w:rPr>
-        <w:t>Síla větru (</w:t>
-      </w:r>
-      <w:proofErr w:type="spellStart"/>
-      <w:r>
+        <w:t>Srážky (data_volumeMm)</w:t>
+      </w:r>
+    </w:p>
+    <w:p>
+      <w:pPr>
+        <w:pStyle w:val="Odstavecseseznamem"/>
+        <w:numPr>
+          <w:ilvl w:val="0"/>
+          <w:numId w:val="1"/>
+        </w:numPr>
+      </w:pPr>
+      <w:r>
+        <w:t>Srážky jsou v průměru velmi nízké – 0,02</w:t>
+      </w:r>
+      <w:r>
+        <w:rPr>
+          <w:rFonts w:ascii="Arial" w:hAnsi="Arial" w:cs="Arial"/>
+        </w:rPr>
+        <w:t> </w:t>
+      </w:r>
+      <w:r>
+        <w:t>mm. Medi</w:t>
+      </w:r>
+      <w:r>
+        <w:rPr>
+          <w:rFonts w:ascii="Aptos" w:hAnsi="Aptos" w:cs="Aptos"/>
+        </w:rPr>
+        <w:t>á</w:t>
+      </w:r>
+      <w:r>
+        <w:t>n je 0, tedy v</w:t>
+      </w:r>
+      <w:r>
+        <w:rPr>
+          <w:rFonts w:ascii="Aptos" w:hAnsi="Aptos" w:cs="Aptos"/>
+        </w:rPr>
+        <w:t>ě</w:t>
+      </w:r>
+      <w:r>
+        <w:t>t</w:t>
+      </w:r>
+      <w:r>
+        <w:rPr>
+          <w:rFonts w:ascii="Aptos" w:hAnsi="Aptos" w:cs="Aptos"/>
+        </w:rPr>
+        <w:t>š</w:t>
+      </w:r>
+      <w:r>
+        <w:t xml:space="preserve">ina </w:t>
+      </w:r>
+      <w:r>
+        <w:rPr>
+          <w:rFonts w:ascii="Aptos" w:hAnsi="Aptos" w:cs="Aptos"/>
+        </w:rPr>
+        <w:t>č</w:t>
+      </w:r>
+      <w:r>
+        <w:t>asov</w:t>
+      </w:r>
+      <w:r>
+        <w:rPr>
+          <w:rFonts w:ascii="Aptos" w:hAnsi="Aptos" w:cs="Aptos"/>
+        </w:rPr>
+        <w:t>ý</w:t>
+      </w:r>
+      <w:r>
+        <w:t>ch z</w:t>
+      </w:r>
+      <w:r>
+        <w:rPr>
+          <w:rFonts w:ascii="Aptos" w:hAnsi="Aptos" w:cs="Aptos"/>
+        </w:rPr>
+        <w:t>á</w:t>
+      </w:r>
+      <w:r>
+        <w:t>znam</w:t>
+      </w:r>
+      <w:r>
+        <w:rPr>
+          <w:rFonts w:ascii="Aptos" w:hAnsi="Aptos" w:cs="Aptos"/>
+        </w:rPr>
+        <w:t>ů</w:t>
+      </w:r>
+      <w:r>
+        <w:t xml:space="preserve"> byla bez sr</w:t>
+      </w:r>
+      <w:r>
+        <w:rPr>
+          <w:rFonts w:ascii="Aptos" w:hAnsi="Aptos" w:cs="Aptos"/>
+        </w:rPr>
+        <w:t>áž</w:t>
+      </w:r>
+      <w:r>
+        <w:t>ek. Maximum dos</w:t>
+      </w:r>
+      <w:r>
+        <w:rPr>
+          <w:rFonts w:ascii="Aptos" w:hAnsi="Aptos" w:cs="Aptos"/>
+        </w:rPr>
+        <w:t>á</w:t>
+      </w:r>
+      <w:r>
+        <w:t>hlo 17,85</w:t>
+      </w:r>
+      <w:r>
+        <w:rPr>
+          <w:rFonts w:ascii="Arial" w:hAnsi="Arial" w:cs="Arial"/>
+        </w:rPr>
+        <w:t> </w:t>
+      </w:r>
+      <w:r>
+        <w:t>mm/h. Rozd</w:t>
+      </w:r>
+      <w:r>
+        <w:rPr>
+          <w:rFonts w:ascii="Aptos" w:hAnsi="Aptos" w:cs="Aptos"/>
+        </w:rPr>
+        <w:t>ě</w:t>
+      </w:r>
+      <w:r>
+        <w:t>len</w:t>
+      </w:r>
+      <w:r>
+        <w:rPr>
+          <w:rFonts w:ascii="Aptos" w:hAnsi="Aptos" w:cs="Aptos"/>
+        </w:rPr>
+        <w:t>í</w:t>
+      </w:r>
+      <w:r>
+        <w:t xml:space="preserve"> je extr</w:t>
+      </w:r>
+      <w:r>
+        <w:rPr>
+          <w:rFonts w:ascii="Aptos" w:hAnsi="Aptos" w:cs="Aptos"/>
+        </w:rPr>
+        <w:t>é</w:t>
+      </w:r>
+      <w:r>
+        <w:t>mn</w:t>
+      </w:r>
+      <w:r>
+        <w:rPr>
+          <w:rFonts w:ascii="Aptos" w:hAnsi="Aptos" w:cs="Aptos"/>
+        </w:rPr>
+        <w:t>ě</w:t>
+      </w:r>
+      <w:r>
+        <w:t xml:space="preserve"> </w:t>
+      </w:r>
+      <w:r>
+        <w:rPr>
+          <w:rFonts w:ascii="Aptos" w:hAnsi="Aptos" w:cs="Aptos"/>
+        </w:rPr>
+        <w:t>š</w:t>
+      </w:r>
+      <w:r>
+        <w:t>ikm</w:t>
+      </w:r>
+      <w:r>
+        <w:rPr>
+          <w:rFonts w:ascii="Aptos" w:hAnsi="Aptos" w:cs="Aptos"/>
+        </w:rPr>
+        <w:t>é</w:t>
+      </w:r>
+      <w:r>
+        <w:t xml:space="preserve"> doprava (skewness = 45,74) a s velmi vysokou </w:t>
+      </w:r>
+      <w:r>
+        <w:rPr>
+          <w:rFonts w:ascii="Aptos" w:hAnsi="Aptos" w:cs="Aptos"/>
+        </w:rPr>
+        <w:t>š</w:t>
+      </w:r>
+      <w:r>
+        <w:t>pi</w:t>
+      </w:r>
+      <w:r>
+        <w:rPr>
+          <w:rFonts w:ascii="Aptos" w:hAnsi="Aptos" w:cs="Aptos"/>
+        </w:rPr>
+        <w:t>č</w:t>
+      </w:r>
+      <w:r>
+        <w:t>atost</w:t>
+      </w:r>
+      <w:r>
+        <w:rPr>
+          <w:rFonts w:ascii="Aptos" w:hAnsi="Aptos" w:cs="Aptos"/>
+        </w:rPr>
+        <w:t>í</w:t>
+      </w:r>
+      <w:r>
+        <w:t xml:space="preserve"> (kurtosis = 2820,38), co</w:t>
+      </w:r>
+      <w:r>
+        <w:rPr>
+          <w:rFonts w:ascii="Aptos" w:hAnsi="Aptos" w:cs="Aptos"/>
+        </w:rPr>
+        <w:t>ž</w:t>
+      </w:r>
+      <w:r>
+        <w:t xml:space="preserve"> odpov</w:t>
+      </w:r>
+      <w:r>
+        <w:rPr>
+          <w:rFonts w:ascii="Aptos" w:hAnsi="Aptos" w:cs="Aptos"/>
+        </w:rPr>
+        <w:t>í</w:t>
+      </w:r>
+      <w:r>
+        <w:t>d</w:t>
+      </w:r>
+      <w:r>
+        <w:rPr>
+          <w:rFonts w:ascii="Aptos" w:hAnsi="Aptos" w:cs="Aptos"/>
+        </w:rPr>
+        <w:t>á</w:t>
+      </w:r>
+      <w:r>
+        <w:t xml:space="preserve"> ob</w:t>
+      </w:r>
+      <w:r>
+        <w:rPr>
+          <w:rFonts w:ascii="Aptos" w:hAnsi="Aptos" w:cs="Aptos"/>
+        </w:rPr>
+        <w:t>č</w:t>
+      </w:r>
+      <w:r>
+        <w:t>asn</w:t>
+      </w:r>
+      <w:r>
+        <w:rPr>
+          <w:rFonts w:ascii="Aptos" w:hAnsi="Aptos" w:cs="Aptos"/>
+        </w:rPr>
+        <w:t>ý</w:t>
+      </w:r>
+      <w:r>
+        <w:t>m siln</w:t>
+      </w:r>
+      <w:r>
+        <w:rPr>
+          <w:rFonts w:ascii="Aptos" w:hAnsi="Aptos" w:cs="Aptos"/>
+        </w:rPr>
+        <w:t>ý</w:t>
+      </w:r>
+      <w:r>
+        <w:t>m sr</w:t>
+      </w:r>
+      <w:r>
+        <w:rPr>
+          <w:rFonts w:ascii="Aptos" w:hAnsi="Aptos" w:cs="Aptos"/>
+        </w:rPr>
+        <w:t>áž</w:t>
+      </w:r>
+      <w:r>
+        <w:t>k</w:t>
+      </w:r>
+      <w:r>
+        <w:rPr>
+          <w:rFonts w:ascii="Aptos" w:hAnsi="Aptos" w:cs="Aptos"/>
+        </w:rPr>
+        <w:t>á</w:t>
+      </w:r>
+      <w:r>
+        <w:t>m b</w:t>
+      </w:r>
+      <w:r>
+        <w:rPr>
+          <w:rFonts w:ascii="Aptos" w:hAnsi="Aptos" w:cs="Aptos"/>
+        </w:rPr>
+        <w:t>ě</w:t>
+      </w:r>
+      <w:r>
+        <w:t>hem jinak such</w:t>
+      </w:r>
+      <w:r>
+        <w:rPr>
+          <w:rFonts w:ascii="Aptos" w:hAnsi="Aptos" w:cs="Aptos"/>
+        </w:rPr>
+        <w:t>é</w:t>
+      </w:r>
+      <w:r>
+        <w:t>ho obdob</w:t>
+      </w:r>
+      <w:r>
+        <w:rPr>
+          <w:rFonts w:ascii="Aptos" w:hAnsi="Aptos" w:cs="Aptos"/>
+        </w:rPr>
+        <w:t>í</w:t>
+      </w:r>
+      <w:r>
+        <w:t>.</w:t>
+      </w:r>
+    </w:p>
+    <w:p>
+      <w:pPr>
         <w:rPr>
           <w:b/>
           <w:bCs/>
         </w:rPr>
-        <w:t>data_windImpact</w:t>
-      </w:r>
-      <w:proofErr w:type="spellEnd"/>
-      <w:r>
-        <w:rPr>
-          <w:b/>
-          <w:bCs/>
-        </w:rPr>
-        <w:t>)</w:t>
-      </w:r>
-    </w:p>
-    <w:p>
-      <w:pPr>
-        <w:pStyle w:val="Odstavecseseznamem"/>
-        <w:numPr>
-          <w:ilvl w:val="0"/>
-          <w:numId w:val="1"/>
-        </w:numPr>
-      </w:pPr>
-      <w:r>
-        <w:t>Síla větru (pravděpodobně kombinace směru a rychlosti) má průměr 7,45, medián 5,76. Hodnoty se pohybují mezi 0 a 45,6. Také zde je rozdělení šikmé doprava (</w:t>
-      </w:r>
-      <w:proofErr w:type="spellStart"/>
-      <w:r>
-        <w:t>skewness</w:t>
-      </w:r>
-      <w:proofErr w:type="spellEnd"/>
-      <w:r>
-        <w:t xml:space="preserve"> = 1,44), což může ukazovat na občasné silnější vlivy větru.</w:t>
-      </w:r>
-    </w:p>
-    <w:p>
-      <w:pPr>
-        <w:rPr>
-          <w:b/>
-          <w:bCs/>
-        </w:rPr>
-      </w:pPr>
-      <w:r>
-        <w:rPr>
-          <w:b/>
-          <w:bCs/>
-        </w:rPr>
-        <w:t>Srážky (</w:t>
-      </w:r>
-      <w:proofErr w:type="spellStart"/>
-      <w:r>
-        <w:rPr>
-          <w:b/>
-          <w:bCs/>
-        </w:rPr>
-        <w:t>data_volumeMm</w:t>
-      </w:r>
-      <w:proofErr w:type="spellEnd"/>
-      <w:r>
-        <w:rPr>
-          <w:b/>
-          <w:bCs/>
-        </w:rPr>
-        <w:t>)</w:t>
-      </w:r>
-    </w:p>
-    <w:p>
-      <w:pPr>
-        <w:pStyle w:val="Odstavecseseznamem"/>
-        <w:numPr>
-          <w:ilvl w:val="0"/>
-          <w:numId w:val="1"/>
-        </w:numPr>
-      </w:pPr>
-      <w:r>
-        <w:t>Srážky jsou v průměru velmi nízké – 0,02</w:t>
-      </w:r>
-      <w:r>
-        <w:rPr>
-          <w:rFonts w:ascii="Arial" w:hAnsi="Arial" w:cs="Arial"/>
-        </w:rPr>
-        <w:t> </w:t>
-      </w:r>
-      <w:r>
-        <w:t>mm. Medi</w:t>
-      </w:r>
-      <w:r>
-        <w:rPr>
-          <w:rFonts w:ascii="Aptos" w:hAnsi="Aptos" w:cs="Aptos"/>
-        </w:rPr>
-        <w:t>á</w:t>
-      </w:r>
-      <w:r>
-        <w:t>n je 0, tedy v</w:t>
-      </w:r>
-      <w:r>
-        <w:rPr>
-          <w:rFonts w:ascii="Aptos" w:hAnsi="Aptos" w:cs="Aptos"/>
-        </w:rPr>
-        <w:t>ě</w:t>
-      </w:r>
-      <w:r>
-        <w:t>t</w:t>
-      </w:r>
-      <w:r>
-        <w:rPr>
-          <w:rFonts w:ascii="Aptos" w:hAnsi="Aptos" w:cs="Aptos"/>
-        </w:rPr>
-        <w:t>š</w:t>
-      </w:r>
-      <w:r>
-        <w:t xml:space="preserve">ina </w:t>
-      </w:r>
-      <w:r>
-        <w:rPr>
-          <w:rFonts w:ascii="Aptos" w:hAnsi="Aptos" w:cs="Aptos"/>
-        </w:rPr>
-        <w:t>č</w:t>
-      </w:r>
-      <w:r>
-        <w:t>asov</w:t>
-      </w:r>
-      <w:r>
-        <w:rPr>
-          <w:rFonts w:ascii="Aptos" w:hAnsi="Aptos" w:cs="Aptos"/>
-        </w:rPr>
-        <w:t>ý</w:t>
-      </w:r>
-      <w:r>
-        <w:t>ch z</w:t>
-      </w:r>
-      <w:r>
-        <w:rPr>
-          <w:rFonts w:ascii="Aptos" w:hAnsi="Aptos" w:cs="Aptos"/>
-        </w:rPr>
-        <w:t>á</w:t>
-      </w:r>
-      <w:r>
-        <w:t>znam</w:t>
-      </w:r>
-      <w:r>
-        <w:rPr>
-          <w:rFonts w:ascii="Aptos" w:hAnsi="Aptos" w:cs="Aptos"/>
-        </w:rPr>
-        <w:t>ů</w:t>
-      </w:r>
-      <w:r>
-        <w:t xml:space="preserve"> byla bez sr</w:t>
-      </w:r>
-      <w:r>
-        <w:rPr>
-          <w:rFonts w:ascii="Aptos" w:hAnsi="Aptos" w:cs="Aptos"/>
-        </w:rPr>
-        <w:t>áž</w:t>
-      </w:r>
-      <w:r>
-        <w:t>ek. Maximum dos</w:t>
-      </w:r>
-      <w:r>
-        <w:rPr>
-          <w:rFonts w:ascii="Aptos" w:hAnsi="Aptos" w:cs="Aptos"/>
-        </w:rPr>
-        <w:t>á</w:t>
-      </w:r>
-      <w:r>
-        <w:t>hlo 17,85</w:t>
-      </w:r>
-      <w:r>
-        <w:rPr>
-          <w:rFonts w:ascii="Arial" w:hAnsi="Arial" w:cs="Arial"/>
-        </w:rPr>
-        <w:t> </w:t>
-      </w:r>
-      <w:r>
-        <w:t>mm/h. Rozd</w:t>
-      </w:r>
-      <w:r>
-        <w:rPr>
-          <w:rFonts w:ascii="Aptos" w:hAnsi="Aptos" w:cs="Aptos"/>
-        </w:rPr>
-        <w:t>ě</w:t>
-      </w:r>
-      <w:r>
-        <w:t>len</w:t>
-      </w:r>
-      <w:r>
-        <w:rPr>
-          <w:rFonts w:ascii="Aptos" w:hAnsi="Aptos" w:cs="Aptos"/>
-        </w:rPr>
-        <w:t>í</w:t>
-      </w:r>
-      <w:r>
-        <w:t xml:space="preserve"> je extr</w:t>
-      </w:r>
-      <w:r>
-        <w:rPr>
-          <w:rFonts w:ascii="Aptos" w:hAnsi="Aptos" w:cs="Aptos"/>
-        </w:rPr>
-        <w:t>é</w:t>
-      </w:r>
-      <w:r>
-        <w:t>mn</w:t>
-      </w:r>
-      <w:r>
-        <w:rPr>
-          <w:rFonts w:ascii="Aptos" w:hAnsi="Aptos" w:cs="Aptos"/>
-        </w:rPr>
-        <w:t>ě</w:t>
-      </w:r>
-      <w:r>
-        <w:t xml:space="preserve"> </w:t>
-      </w:r>
-      <w:r>
-        <w:rPr>
-          <w:rFonts w:ascii="Aptos" w:hAnsi="Aptos" w:cs="Aptos"/>
-        </w:rPr>
-        <w:t>š</w:t>
-      </w:r>
-      <w:r>
-        <w:t>ikm</w:t>
-      </w:r>
-      <w:r>
-        <w:rPr>
-          <w:rFonts w:ascii="Aptos" w:hAnsi="Aptos" w:cs="Aptos"/>
-        </w:rPr>
-        <w:t>é</w:t>
-      </w:r>
-      <w:r>
-        <w:t xml:space="preserve"> doprava (</w:t>
-      </w:r>
-      <w:proofErr w:type="spellStart"/>
-      <w:r>
-        <w:t>skewness</w:t>
-      </w:r>
-      <w:proofErr w:type="spellEnd"/>
-      <w:r>
-        <w:t xml:space="preserve"> = 45,74) a s velmi vysokou </w:t>
-      </w:r>
-      <w:r>
-        <w:rPr>
-          <w:rFonts w:ascii="Aptos" w:hAnsi="Aptos" w:cs="Aptos"/>
-        </w:rPr>
-        <w:t>š</w:t>
-      </w:r>
-      <w:r>
-        <w:t>pi</w:t>
-      </w:r>
-      <w:r>
-        <w:rPr>
-          <w:rFonts w:ascii="Aptos" w:hAnsi="Aptos" w:cs="Aptos"/>
-        </w:rPr>
-        <w:t>č</w:t>
-      </w:r>
-      <w:r>
-        <w:t>atost</w:t>
-      </w:r>
-      <w:r>
-        <w:rPr>
-          <w:rFonts w:ascii="Aptos" w:hAnsi="Aptos" w:cs="Aptos"/>
-        </w:rPr>
-        <w:t>í</w:t>
-      </w:r>
-      <w:r>
-        <w:t xml:space="preserve"> (</w:t>
-      </w:r>
-      <w:proofErr w:type="spellStart"/>
-      <w:r>
-        <w:t>kurtosis</w:t>
-      </w:r>
-      <w:proofErr w:type="spellEnd"/>
-      <w:r>
-        <w:t xml:space="preserve"> = 2820,38), co</w:t>
-      </w:r>
-      <w:r>
-        <w:rPr>
-          <w:rFonts w:ascii="Aptos" w:hAnsi="Aptos" w:cs="Aptos"/>
-        </w:rPr>
-        <w:t>ž</w:t>
-      </w:r>
-      <w:r>
-        <w:t xml:space="preserve"> odpov</w:t>
-      </w:r>
-      <w:r>
-        <w:rPr>
-          <w:rFonts w:ascii="Aptos" w:hAnsi="Aptos" w:cs="Aptos"/>
-        </w:rPr>
-        <w:t>í</w:t>
-      </w:r>
-      <w:r>
-        <w:t>d</w:t>
-      </w:r>
-      <w:r>
-        <w:rPr>
-          <w:rFonts w:ascii="Aptos" w:hAnsi="Aptos" w:cs="Aptos"/>
-        </w:rPr>
-        <w:t>á</w:t>
-      </w:r>
-      <w:r>
-        <w:t xml:space="preserve"> ob</w:t>
-      </w:r>
-      <w:r>
-        <w:rPr>
-          <w:rFonts w:ascii="Aptos" w:hAnsi="Aptos" w:cs="Aptos"/>
-        </w:rPr>
-        <w:t>č</w:t>
-      </w:r>
-      <w:r>
-        <w:t>asn</w:t>
-      </w:r>
-      <w:r>
-        <w:rPr>
-          <w:rFonts w:ascii="Aptos" w:hAnsi="Aptos" w:cs="Aptos"/>
-        </w:rPr>
-        <w:t>ý</w:t>
-      </w:r>
-      <w:r>
-        <w:t>m siln</w:t>
-      </w:r>
-      <w:r>
-        <w:rPr>
-          <w:rFonts w:ascii="Aptos" w:hAnsi="Aptos" w:cs="Aptos"/>
-        </w:rPr>
-        <w:t>ý</w:t>
-      </w:r>
-      <w:r>
-        <w:t>m sr</w:t>
-      </w:r>
-      <w:r>
-        <w:rPr>
-          <w:rFonts w:ascii="Aptos" w:hAnsi="Aptos" w:cs="Aptos"/>
-        </w:rPr>
-        <w:t>áž</w:t>
-      </w:r>
-      <w:r>
-        <w:t>k</w:t>
-      </w:r>
-      <w:r>
-        <w:rPr>
-          <w:rFonts w:ascii="Aptos" w:hAnsi="Aptos" w:cs="Aptos"/>
-        </w:rPr>
-        <w:t>á</w:t>
-      </w:r>
-      <w:r>
-        <w:t>m b</w:t>
-      </w:r>
-      <w:r>
-        <w:rPr>
-          <w:rFonts w:ascii="Aptos" w:hAnsi="Aptos" w:cs="Aptos"/>
-        </w:rPr>
-        <w:t>ě</w:t>
-      </w:r>
-      <w:r>
-        <w:t>hem jinak such</w:t>
-      </w:r>
-      <w:r>
-        <w:rPr>
-          <w:rFonts w:ascii="Aptos" w:hAnsi="Aptos" w:cs="Aptos"/>
-        </w:rPr>
-        <w:t>é</w:t>
-      </w:r>
-      <w:r>
-        <w:t>ho obdob</w:t>
-      </w:r>
-      <w:r>
-        <w:rPr>
-          <w:rFonts w:ascii="Aptos" w:hAnsi="Aptos" w:cs="Aptos"/>
-        </w:rPr>
-        <w:t>í</w:t>
-      </w:r>
-      <w:r>
-        <w:t>.</w:t>
-      </w:r>
-    </w:p>
-    <w:p>
-      <w:pPr>
-        <w:rPr>
-          <w:b/>
-          <w:bCs/>
-        </w:rPr>
       </w:pPr>
     </w:p>
     <w:p>
@@ -5117,15 +4407,7 @@
         <w:pStyle w:val="Nadpis3"/>
       </w:pPr>
       <w:r>
-        <w:t>Auta (</w:t>
-      </w:r>
-      <w:proofErr w:type="spellStart"/>
-      <w:r>
-        <w:t>ddb</w:t>
-      </w:r>
-      <w:proofErr w:type="spellEnd"/>
-      <w:r>
-        <w:t>)</w:t>
+        <w:t>Auta (ddb)</w:t>
       </w:r>
     </w:p>
     <w:p>
@@ -5219,13 +4501,8 @@
           <w:numId w:val="1"/>
         </w:numPr>
       </w:pPr>
-      <w:proofErr w:type="spellStart"/>
-      <w:r>
-        <w:t>kurtosis</w:t>
-      </w:r>
-      <w:proofErr w:type="spellEnd"/>
-      <w:r>
-        <w:t xml:space="preserve"> je negativní → rozložení je plošší, bez extrémních špiček</w:t>
+      <w:r>
+        <w:t>kurtosis je negativní → rozložení je plošší, bez extrémních špiček</w:t>
       </w:r>
     </w:p>
     <w:p>
@@ -5247,15 +4524,7 @@
         <w:pStyle w:val="Nadpis3"/>
       </w:pPr>
       <w:r>
-        <w:t>Ovzduší (</w:t>
-      </w:r>
-      <w:proofErr w:type="spellStart"/>
-      <w:r>
-        <w:t>pm</w:t>
-      </w:r>
-      <w:proofErr w:type="spellEnd"/>
-      <w:r>
-        <w:t>)</w:t>
+        <w:t>Ovzduší (pm)</w:t>
       </w:r>
     </w:p>
     <w:p>
@@ -5273,15 +4542,7 @@
         <w:pStyle w:val="Nadpis3"/>
       </w:pPr>
       <w:r>
-        <w:t>Počasí (</w:t>
-      </w:r>
-      <w:proofErr w:type="spellStart"/>
-      <w:r>
-        <w:t>meteo</w:t>
-      </w:r>
-      <w:proofErr w:type="spellEnd"/>
-      <w:r>
-        <w:t>)</w:t>
+        <w:t>Počasí (meteo)</w:t>
       </w:r>
     </w:p>
     <w:p>
@@ -5299,15 +4560,7 @@
         <w:pStyle w:val="Nadpis3"/>
       </w:pPr>
       <w:r>
-        <w:t>Auta (</w:t>
-      </w:r>
-      <w:proofErr w:type="spellStart"/>
-      <w:r>
-        <w:t>ddb</w:t>
-      </w:r>
-      <w:proofErr w:type="spellEnd"/>
-      <w:r>
-        <w:t>)</w:t>
+        <w:t>Auta (ddb)</w:t>
       </w:r>
     </w:p>
     <w:p>
@@ -5347,15 +4600,7 @@
         <w:pStyle w:val="Nadpis3"/>
       </w:pPr>
       <w:r>
-        <w:t>Ovzduší (</w:t>
-      </w:r>
-      <w:proofErr w:type="spellStart"/>
-      <w:r>
-        <w:t>pm</w:t>
-      </w:r>
-      <w:proofErr w:type="spellEnd"/>
-      <w:r>
-        <w:t>)</w:t>
+        <w:t>Ovzduší (pm)</w:t>
       </w:r>
     </w:p>
     <w:p>
@@ -5407,31 +4652,7 @@
     </w:p>
     <w:p>
       <w:r>
-        <w:t xml:space="preserve">Vzhledem k extrémní korelaci – abych neanalyzoval všechny PM proměnné (kvůli </w:t>
-      </w:r>
-      <w:proofErr w:type="spellStart"/>
-      <w:r>
-        <w:t>multikolinearitě</w:t>
-      </w:r>
-      <w:proofErr w:type="spellEnd"/>
-      <w:r>
-        <w:t xml:space="preserve"> v regresních modelech, zbytečných duplikací výstupů a komplikovanější interpretaci bez většího přínosu), zvolím </w:t>
-      </w:r>
-      <w:proofErr w:type="spellStart"/>
-      <w:r>
-        <w:t>redudanci</w:t>
-      </w:r>
-      <w:proofErr w:type="spellEnd"/>
-      <w:r>
-        <w:t xml:space="preserve"> proměnných </w:t>
-      </w:r>
-      <w:proofErr w:type="spellStart"/>
-      <w:r>
-        <w:t>data_pm</w:t>
-      </w:r>
-      <w:proofErr w:type="spellEnd"/>
-      <w:r>
-        <w:t>*</w:t>
+        <w:t>Vzhledem k extrémní korelaci – abych neanalyzoval všechny PM proměnné (kvůli multikolinearitě v regresních modelech, zbytečných duplikací výstupů a komplikovanější interpretaci bez většího přínosu), zvolím redudanci proměnných data_pm*</w:t>
       </w:r>
     </w:p>
     <w:p>
@@ -5541,15 +4762,7 @@
         </w:numPr>
       </w:pPr>
       <w:r>
-        <w:t>výrazná přítomnost odlehlých hodnot (</w:t>
-      </w:r>
-      <w:proofErr w:type="spellStart"/>
-      <w:r>
-        <w:t>outliers</w:t>
-      </w:r>
-      <w:proofErr w:type="spellEnd"/>
-      <w:r>
-        <w:t>) naznačuje nutnost pečlivé předzpracování dat před modelováním nebo dalšími analýzami</w:t>
+        <w:t>výrazná přítomnost odlehlých hodnot (outliers) naznačuje nutnost pečlivé předzpracování dat před modelováním nebo dalšími analýzami</w:t>
       </w:r>
     </w:p>
     <w:p>
@@ -5573,15 +4786,7 @@
         </w:numPr>
       </w:pPr>
       <w:r>
-        <w:t xml:space="preserve">Distribuce je výrazně </w:t>
-      </w:r>
-      <w:proofErr w:type="spellStart"/>
-      <w:r>
-        <w:t>pravošikmá</w:t>
-      </w:r>
-      <w:proofErr w:type="spellEnd"/>
-      <w:r>
-        <w:t xml:space="preserve"> (pozitivně šikmá) – většina hodnot se pohybuje v nižších koncentracích (do cca 50 µg/m³), ale objevují se i extrémně vysoké hodnoty přesahující 800 µg/m³, což pravděpodobně odpovídá chybám měření nebo extrémním událostem</w:t>
+        <w:t>Distribuce je výrazně pravošikmá (pozitivně šikmá) – většina hodnot se pohybuje v nižších koncentracích (do cca 50 µg/m³), ale objevují se i extrémně vysoké hodnoty přesahující 800 µg/m³, což pravděpodobně odpovídá chybám měření nebo extrémním událostem</w:t>
       </w:r>
     </w:p>
     <w:p>
@@ -5910,15 +5115,7 @@
         </w:numPr>
       </w:pPr>
       <w:r>
-        <w:t xml:space="preserve">Koncentrace NO₂ má </w:t>
-      </w:r>
-      <w:proofErr w:type="spellStart"/>
-      <w:r>
-        <w:t>pravostranně</w:t>
-      </w:r>
-      <w:proofErr w:type="spellEnd"/>
-      <w:r>
-        <w:t xml:space="preserve"> šikmé rozdělení – většina hodnot je koncentrována v nižších hodnotách (do cca 30 µg/m³).</w:t>
+        <w:t>Koncentrace NO₂ má pravostranně šikmé rozdělení – většina hodnot je koncentrována v nižších hodnotách (do cca 30 µg/m³).</w:t>
       </w:r>
     </w:p>
     <w:p>
@@ -5942,15 +5139,7 @@
         </w:numPr>
       </w:pPr>
       <w:r>
-        <w:t>Histogram ukazuje poměrně přirozené znečištění s několika extrémními hodnotami (</w:t>
-      </w:r>
-      <w:proofErr w:type="spellStart"/>
-      <w:r>
-        <w:t>outliery</w:t>
-      </w:r>
-      <w:proofErr w:type="spellEnd"/>
-      <w:r>
-        <w:t>)</w:t>
+        <w:t>Histogram ukazuje poměrně přirozené znečištění s několika extrémními hodnotami (outliery)</w:t>
       </w:r>
     </w:p>
     <w:p>
@@ -6264,15 +5453,7 @@
         <w:pStyle w:val="Nadpis3"/>
       </w:pPr>
       <w:r>
-        <w:t>Počasí (</w:t>
-      </w:r>
-      <w:proofErr w:type="spellStart"/>
-      <w:r>
-        <w:t>meteo</w:t>
-      </w:r>
-      <w:proofErr w:type="spellEnd"/>
-      <w:r>
-        <w:t>)</w:t>
+        <w:t>Počasí (meteo)</w:t>
       </w:r>
     </w:p>
     <w:p>
@@ -6344,15 +5525,7 @@
         </w:numPr>
       </w:pPr>
       <w:r>
-        <w:t>Budeme tudíž počítat pouze s </w:t>
-      </w:r>
-      <w:proofErr w:type="spellStart"/>
-      <w:r>
-        <w:t>windSpeed</w:t>
-      </w:r>
-      <w:proofErr w:type="spellEnd"/>
-      <w:r>
-        <w:t xml:space="preserve"> jako s proměnnou, která zastupuje větrnou složku v počasí</w:t>
+        <w:t>Budeme tudíž počítat pouze s windSpeed jako s proměnnou, která zastupuje větrnou složku v počasí</w:t>
       </w:r>
     </w:p>
     <w:p>
@@ -6799,15 +5972,7 @@
       </w:pPr>
       <w:r>
         <w:lastRenderedPageBreak/>
-        <w:t>Auta (</w:t>
-      </w:r>
-      <w:proofErr w:type="spellStart"/>
-      <w:r>
-        <w:t>ddb</w:t>
-      </w:r>
-      <w:proofErr w:type="spellEnd"/>
-      <w:r>
-        <w:t>)</w:t>
+        <w:t>Auta (ddb)</w:t>
       </w:r>
     </w:p>
     <w:p>
@@ -7263,43 +6428,19 @@
         </w:numPr>
       </w:pPr>
       <w:r>
-        <w:t xml:space="preserve">Sjednocení všech tří data </w:t>
-      </w:r>
-      <w:proofErr w:type="spellStart"/>
-      <w:r>
-        <w:t>frames</w:t>
-      </w:r>
-      <w:proofErr w:type="spellEnd"/>
-      <w:r>
-        <w:t xml:space="preserve"> do jedné tabulky – pro přehlednost chybějících hodnot, pro lehkost manipulace s daty</w:t>
-      </w:r>
-    </w:p>
-    <w:p>
-      <w:pPr>
-        <w:pStyle w:val="Odstavecseseznamem"/>
-        <w:numPr>
-          <w:ilvl w:val="0"/>
-          <w:numId w:val="7"/>
-        </w:numPr>
-      </w:pPr>
-      <w:r>
-        <w:t>Problém s </w:t>
-      </w:r>
-      <w:proofErr w:type="spellStart"/>
-      <w:r>
-        <w:t>meteo</w:t>
-      </w:r>
-      <w:proofErr w:type="spellEnd"/>
-      <w:r>
-        <w:t xml:space="preserve"> a </w:t>
-      </w:r>
-      <w:proofErr w:type="spellStart"/>
-      <w:r>
-        <w:t>polution</w:t>
-      </w:r>
-      <w:proofErr w:type="spellEnd"/>
-      <w:r>
-        <w:t xml:space="preserve"> daty po 15.1.2025 – tyto data neuvažuji dále</w:t>
+        <w:t>Sjednocení všech tří data frames do jedné tabulky – pro přehlednost chybějících hodnot, pro lehkost manipulace s daty</w:t>
+      </w:r>
+    </w:p>
+    <w:p>
+      <w:pPr>
+        <w:pStyle w:val="Odstavecseseznamem"/>
+        <w:numPr>
+          <w:ilvl w:val="0"/>
+          <w:numId w:val="7"/>
+        </w:numPr>
+      </w:pPr>
+      <w:r>
+        <w:t>Problém s meteo a polution daty po 15.1.2025 – tyto data neuvažuji dále</w:t>
       </w:r>
     </w:p>
     <w:p>
@@ -7353,15 +6494,7 @@
           </w:tcPr>
           <w:p>
             <w:r>
-              <w:t>1.3 (celý den), 3.4 9:00, 15.5 0-7:00, 17.5 5-6:</w:t>
-            </w:r>
-            <w:proofErr w:type="gramStart"/>
-            <w:r>
-              <w:t>00,  27.6</w:t>
-            </w:r>
-            <w:proofErr w:type="gramEnd"/>
-            <w:r>
-              <w:t xml:space="preserve"> 16:00-23:00, 28.6 00-6:00, 12.7 11:00-23:00, 13.7-15.7, 27.10 2:00</w:t>
+              <w:t>1.3 (celý den), 3.4 9:00, 15.5 0-7:00, 17.5 5-6:00,  27.6 16:00-23:00, 28.6 00-6:00, 12.7 11:00-23:00, 13.7-15.7, 27.10 2:00</w:t>
             </w:r>
           </w:p>
         </w:tc>
@@ -7372,19 +6505,9 @@
             <w:tcW w:w="3397" w:type="dxa"/>
           </w:tcPr>
           <w:p>
-            <w:proofErr w:type="spellStart"/>
-            <w:r>
-              <w:t>Meteo</w:t>
-            </w:r>
-            <w:proofErr w:type="spellEnd"/>
-            <w:r>
-              <w:t xml:space="preserve"> + </w:t>
-            </w:r>
-            <w:proofErr w:type="spellStart"/>
-            <w:r>
-              <w:t>polution</w:t>
-            </w:r>
-            <w:proofErr w:type="spellEnd"/>
+            <w:r>
+              <w:t>Meteo + polution</w:t>
+            </w:r>
           </w:p>
         </w:tc>
         <w:tc>
@@ -7415,15 +6538,7 @@
     </w:p>
     <w:p>
       <w:r>
-        <w:t xml:space="preserve">Problém s tím, že časový formát je zapsán v UTC čase a pro zkoumání závislostí na dopravě je důležité, aby provoz nebyl tímto ovlivněn – </w:t>
-      </w:r>
-      <w:proofErr w:type="spellStart"/>
-      <w:r>
-        <w:t>krejí</w:t>
-      </w:r>
-      <w:proofErr w:type="spellEnd"/>
-      <w:r>
-        <w:t xml:space="preserve"> se tak zimní a letní časy do jednoho, co způsobuje nesrovnalost, když chceme zobrazit průměry na hodiny.</w:t>
+        <w:t>Problém s tím, že časový formát je zapsán v UTC čase a pro zkoumání závislostí na dopravě je důležité, aby provoz nebyl tímto ovlivněn – krejí se tak zimní a letní časy do jednoho, co způsobuje nesrovnalost, když chceme zobrazit průměry na hodiny.</w:t>
       </w:r>
       <w:r>
         <w:br/>
@@ -7454,23 +6569,7 @@
         </w:numPr>
       </w:pPr>
       <w:r>
-        <w:t xml:space="preserve">Aplikováno pomocí knihovny </w:t>
-      </w:r>
-      <w:proofErr w:type="spellStart"/>
-      <w:r>
-        <w:t>lubridate</w:t>
-      </w:r>
-      <w:proofErr w:type="spellEnd"/>
-      <w:r>
-        <w:t xml:space="preserve">, kde je databáze časových pásem </w:t>
-      </w:r>
-      <w:proofErr w:type="spellStart"/>
-      <w:r>
-        <w:t>tzdata</w:t>
-      </w:r>
-      <w:proofErr w:type="spellEnd"/>
-      <w:r>
-        <w:t>, který zohlednil i pořadí hodnot</w:t>
+        <w:t>Aplikováno pomocí knihovny lubridate, kde je databáze časových pásem tzdata, který zohlednil i pořadí hodnot</w:t>
       </w:r>
     </w:p>
     <w:p>
@@ -7490,35 +6589,19 @@
         </w:numPr>
       </w:pPr>
       <w:r>
-        <w:t xml:space="preserve">Z grafů zobrazující </w:t>
-      </w:r>
-      <w:proofErr w:type="spellStart"/>
-      <w:r>
-        <w:t>boxploty</w:t>
-      </w:r>
-      <w:proofErr w:type="spellEnd"/>
-      <w:r>
-        <w:t xml:space="preserve"> podle měsíců, zobrazující průměrnou koncentraci PM10, bylo v červencovém měsíci změřeno velmi mnoho odlehlých hodnot</w:t>
-      </w:r>
-    </w:p>
-    <w:p>
-      <w:pPr>
-        <w:pStyle w:val="Odstavecseseznamem"/>
-        <w:numPr>
-          <w:ilvl w:val="0"/>
-          <w:numId w:val="7"/>
-        </w:numPr>
-      </w:pPr>
-      <w:r>
-        <w:t>Proto aplikuji metodu „</w:t>
-      </w:r>
-      <w:proofErr w:type="spellStart"/>
-      <w:r>
-        <w:t>Winsorizace</w:t>
-      </w:r>
-      <w:proofErr w:type="spellEnd"/>
-      <w:r>
-        <w:t>“</w:t>
+        <w:t>Z grafů zobrazující boxploty podle měsíců, zobrazující průměrnou koncentraci PM10, bylo v červencovém měsíci změřeno velmi mnoho odlehlých hodnot</w:t>
+      </w:r>
+    </w:p>
+    <w:p>
+      <w:pPr>
+        <w:pStyle w:val="Odstavecseseznamem"/>
+        <w:numPr>
+          <w:ilvl w:val="0"/>
+          <w:numId w:val="7"/>
+        </w:numPr>
+      </w:pPr>
+      <w:r>
+        <w:t>Proto aplikuji metodu „Winsorizace“</w:t>
       </w:r>
     </w:p>
     <w:p>
@@ -7543,35 +6626,19 @@
         </w:numPr>
       </w:pPr>
       <w:r>
-        <w:t xml:space="preserve">v našem případě aplikujeme jednostrannou </w:t>
-      </w:r>
-      <w:proofErr w:type="spellStart"/>
-      <w:r>
-        <w:t>winsorizaci</w:t>
-      </w:r>
-      <w:proofErr w:type="spellEnd"/>
-      <w:r>
-        <w:t xml:space="preserve"> u proměnné pm100 na hodnotu 150</w:t>
-      </w:r>
-    </w:p>
-    <w:p>
-      <w:pPr>
-        <w:pStyle w:val="Odstavecseseznamem"/>
-        <w:numPr>
-          <w:ilvl w:val="0"/>
-          <w:numId w:val="7"/>
-        </w:numPr>
-      </w:pPr>
-      <w:r>
-        <w:t xml:space="preserve">stejně aplikujeme jednostrannou </w:t>
-      </w:r>
-      <w:proofErr w:type="spellStart"/>
-      <w:r>
-        <w:t>winsorizaci</w:t>
-      </w:r>
-      <w:proofErr w:type="spellEnd"/>
-      <w:r>
-        <w:t xml:space="preserve"> u proměnné NO2 na hodnotu 125</w:t>
+        <w:t>v našem případě aplikujeme jednostrannou winsorizaci u proměnné pm100 na hodnotu 150</w:t>
+      </w:r>
+    </w:p>
+    <w:p>
+      <w:pPr>
+        <w:pStyle w:val="Odstavecseseznamem"/>
+        <w:numPr>
+          <w:ilvl w:val="0"/>
+          <w:numId w:val="7"/>
+        </w:numPr>
+      </w:pPr>
+      <w:r>
+        <w:t>stejně aplikujeme jednostrannou winsorizaci u proměnné NO2 na hodnotu 125</w:t>
       </w:r>
     </w:p>
     <w:p>
@@ -7590,63 +6657,32 @@
           <w:numId w:val="7"/>
         </w:numPr>
       </w:pPr>
-      <w:proofErr w:type="spellStart"/>
-      <w:r>
-        <w:t>den_v_tydnu</w:t>
-      </w:r>
-      <w:proofErr w:type="spellEnd"/>
-      <w:r>
-        <w:t xml:space="preserve"> – textová proměnná odvozena z data a času (</w:t>
-      </w:r>
-      <w:proofErr w:type="spellStart"/>
-      <w:r>
-        <w:t>cas</w:t>
-      </w:r>
-      <w:proofErr w:type="spellEnd"/>
-      <w:r>
-        <w:t>), přepisuje anglické názvy dnů na české zkratky („po“ až „ne“) a nastavuje jejich pořadí.</w:t>
-      </w:r>
-    </w:p>
-    <w:p>
-      <w:pPr>
-        <w:pStyle w:val="Odstavecseseznamem"/>
-        <w:numPr>
-          <w:ilvl w:val="0"/>
-          <w:numId w:val="7"/>
-        </w:numPr>
-      </w:pPr>
-      <w:proofErr w:type="spellStart"/>
-      <w:r>
-        <w:t>month</w:t>
-      </w:r>
-      <w:proofErr w:type="spellEnd"/>
-      <w:r>
-        <w:t xml:space="preserve"> – proměnná s informací o měsíci ve formátu MM/YYYY, získaná z proměnné </w:t>
-      </w:r>
-      <w:proofErr w:type="spellStart"/>
-      <w:r>
-        <w:t>cas</w:t>
-      </w:r>
-      <w:proofErr w:type="spellEnd"/>
-      <w:r>
-        <w:t>.</w:t>
-      </w:r>
-    </w:p>
-    <w:p>
-      <w:pPr>
-        <w:pStyle w:val="Odstavecseseznamem"/>
-        <w:numPr>
-          <w:ilvl w:val="0"/>
-          <w:numId w:val="7"/>
-        </w:numPr>
-      </w:pPr>
-      <w:proofErr w:type="spellStart"/>
-      <w:r>
-        <w:t>tretina_dne</w:t>
-      </w:r>
-      <w:proofErr w:type="spellEnd"/>
-      <w:r>
-        <w:t xml:space="preserve"> – rozdělení dne do třetin podle hodin:</w:t>
+      <w:r>
+        <w:t>den_v_tydnu – textová proměnná odvozena z data a času (cas), přepisuje anglické názvy dnů na české zkratky („po“ až „ne“) a nastavuje jejich pořadí.</w:t>
+      </w:r>
+    </w:p>
+    <w:p>
+      <w:pPr>
+        <w:pStyle w:val="Odstavecseseznamem"/>
+        <w:numPr>
+          <w:ilvl w:val="0"/>
+          <w:numId w:val="7"/>
+        </w:numPr>
+      </w:pPr>
+      <w:r>
+        <w:t>month – proměnná s informací o měsíci ve formátu MM/YYYY, získaná z proměnné cas.</w:t>
+      </w:r>
+    </w:p>
+    <w:p>
+      <w:pPr>
+        <w:pStyle w:val="Odstavecseseznamem"/>
+        <w:numPr>
+          <w:ilvl w:val="0"/>
+          <w:numId w:val="7"/>
+        </w:numPr>
+      </w:pPr>
+      <w:r>
+        <w:t>tretina_dne – rozdělení dne do třetin podle hodin:</w:t>
       </w:r>
     </w:p>
     <w:p>
@@ -7699,64 +6735,44 @@
           <w:numId w:val="7"/>
         </w:numPr>
       </w:pPr>
-      <w:proofErr w:type="spellStart"/>
-      <w:r>
-        <w:t>letni_prazdniny</w:t>
-      </w:r>
-      <w:proofErr w:type="spellEnd"/>
-      <w:r>
-        <w:t xml:space="preserve"> – binární proměnná indikující letní prázdniny (červenec a srpen).</w:t>
-      </w:r>
-    </w:p>
-    <w:p>
-      <w:pPr>
-        <w:pStyle w:val="Odstavecseseznamem"/>
-        <w:numPr>
-          <w:ilvl w:val="0"/>
-          <w:numId w:val="7"/>
-        </w:numPr>
-      </w:pPr>
-      <w:proofErr w:type="spellStart"/>
-      <w:r>
-        <w:t>topna_sezona</w:t>
-      </w:r>
-      <w:proofErr w:type="spellEnd"/>
-      <w:r>
-        <w:t xml:space="preserve"> – binární proměnná označující topnou sezónu (říjen až duben).</w:t>
-      </w:r>
-    </w:p>
-    <w:p>
-      <w:pPr>
-        <w:pStyle w:val="Odstavecseseznamem"/>
-        <w:numPr>
-          <w:ilvl w:val="0"/>
-          <w:numId w:val="7"/>
-        </w:numPr>
-      </w:pPr>
-      <w:proofErr w:type="spellStart"/>
-      <w:r>
-        <w:t>statni_svatky</w:t>
-      </w:r>
-      <w:proofErr w:type="spellEnd"/>
-      <w:r>
-        <w:t xml:space="preserve"> – binární proměnná indikující, zda daný den je státní svátek (podle oficiálních svátků ČR v roce 2024).</w:t>
-      </w:r>
-    </w:p>
-    <w:p>
-      <w:pPr>
-        <w:pStyle w:val="Odstavecseseznamem"/>
-        <w:numPr>
-          <w:ilvl w:val="0"/>
-          <w:numId w:val="7"/>
-        </w:numPr>
-      </w:pPr>
-      <w:proofErr w:type="spellStart"/>
-      <w:r>
-        <w:t>prumerna_teplota_dne</w:t>
-      </w:r>
-      <w:proofErr w:type="spellEnd"/>
-      <w:r>
-        <w:t xml:space="preserve"> – průměrná denní teplota vypočítaná ze 4 hodnot: teplota v 7:00, 14:00 </w:t>
+      <w:r>
+        <w:t>letni_prazdniny – binární proměnná indikující letní prázdniny (červenec a srpen).</w:t>
+      </w:r>
+    </w:p>
+    <w:p>
+      <w:pPr>
+        <w:pStyle w:val="Odstavecseseznamem"/>
+        <w:numPr>
+          <w:ilvl w:val="0"/>
+          <w:numId w:val="7"/>
+        </w:numPr>
+      </w:pPr>
+      <w:r>
+        <w:t>topna_sezona – binární proměnná označující topnou sezónu (říjen až duben).</w:t>
+      </w:r>
+    </w:p>
+    <w:p>
+      <w:pPr>
+        <w:pStyle w:val="Odstavecseseznamem"/>
+        <w:numPr>
+          <w:ilvl w:val="0"/>
+          <w:numId w:val="7"/>
+        </w:numPr>
+      </w:pPr>
+      <w:r>
+        <w:t>statni_svatky – binární proměnná indikující, zda daný den je státní svátek (podle oficiálních svátků ČR v roce 2024).</w:t>
+      </w:r>
+    </w:p>
+    <w:p>
+      <w:pPr>
+        <w:pStyle w:val="Odstavecseseznamem"/>
+        <w:numPr>
+          <w:ilvl w:val="0"/>
+          <w:numId w:val="7"/>
+        </w:numPr>
+      </w:pPr>
+      <w:r>
+        <w:t xml:space="preserve">prumerna_teplota_dne – průměrná denní teplota vypočítaná ze 4 hodnot: teplota v 7:00, 14:00 </w:t>
       </w:r>
       <w:r>
         <w:t xml:space="preserve">a </w:t>
@@ -7796,75 +6812,19 @@
         </w:numPr>
       </w:pPr>
       <w:r>
-        <w:t>měl jsem problém, že když jsem uložil upravená, sjednocená, agregovaná data do .</w:t>
-      </w:r>
-      <w:proofErr w:type="spellStart"/>
-      <w:r>
-        <w:t>csv</w:t>
-      </w:r>
-      <w:proofErr w:type="spellEnd"/>
-      <w:r>
-        <w:t xml:space="preserve"> souboru, některé hodnoty se rozbily v důsledku nezachování typu (například časová hodnota </w:t>
-      </w:r>
-      <w:proofErr w:type="spellStart"/>
-      <w:r>
-        <w:t>dd</w:t>
-      </w:r>
-      <w:proofErr w:type="spellEnd"/>
-      <w:r>
-        <w:t>/mm/</w:t>
-      </w:r>
-      <w:proofErr w:type="spellStart"/>
-      <w:r>
-        <w:t>yyyy</w:t>
-      </w:r>
-      <w:proofErr w:type="spellEnd"/>
-      <w:r>
-        <w:t xml:space="preserve"> 00:00 se uložila jen jako </w:t>
-      </w:r>
-      <w:proofErr w:type="spellStart"/>
-      <w:r>
-        <w:t>dd</w:t>
-      </w:r>
-      <w:proofErr w:type="spellEnd"/>
-      <w:r>
-        <w:t>/mm/</w:t>
-      </w:r>
-      <w:proofErr w:type="spellStart"/>
-      <w:r>
-        <w:t>yyyy</w:t>
-      </w:r>
-      <w:proofErr w:type="spellEnd"/>
-      <w:r>
-        <w:t>)</w:t>
-      </w:r>
-    </w:p>
-    <w:p>
-      <w:pPr>
-        <w:pStyle w:val="Odstavecseseznamem"/>
-        <w:numPr>
-          <w:ilvl w:val="0"/>
-          <w:numId w:val="7"/>
-        </w:numPr>
-      </w:pPr>
-      <w:r>
-        <w:t>proto momentálně ukládám datové soubory jako .</w:t>
-      </w:r>
-      <w:proofErr w:type="spellStart"/>
-      <w:r>
-        <w:t>rds</w:t>
-      </w:r>
-      <w:proofErr w:type="spellEnd"/>
-      <w:r>
-        <w:t xml:space="preserve">, soubor od </w:t>
-      </w:r>
-      <w:proofErr w:type="spellStart"/>
-      <w:r>
-        <w:t>rka</w:t>
-      </w:r>
-      <w:proofErr w:type="spellEnd"/>
-      <w:r>
-        <w:t>, který zachovává i datové typy</w:t>
+        <w:t>měl jsem problém, že když jsem uložil upravená, sjednocená, agregovaná data do .csv souboru, některé hodnoty se rozbily v důsledku nezachování typu (například časová hodnota dd/mm/yyyy 00:00 se uložila jen jako dd/mm/yyyy)</w:t>
+      </w:r>
+    </w:p>
+    <w:p>
+      <w:pPr>
+        <w:pStyle w:val="Odstavecseseznamem"/>
+        <w:numPr>
+          <w:ilvl w:val="0"/>
+          <w:numId w:val="7"/>
+        </w:numPr>
+      </w:pPr>
+      <w:r>
+        <w:t>proto momentálně ukládám datové soubory jako .rds, soubor od rka, který zachovává i datové typy</w:t>
       </w:r>
     </w:p>
     <w:p>
@@ -7883,28 +6843,12 @@
     </w:p>
     <w:p>
       <w:r>
-        <w:t xml:space="preserve">Po sloučení a agregaci všech vstupních dat vznikl datový rámec data, kde každý řádek představuje jednu hodinu. Tento </w:t>
-      </w:r>
-      <w:proofErr w:type="spellStart"/>
-      <w:r>
-        <w:t>dataset</w:t>
-      </w:r>
-      <w:proofErr w:type="spellEnd"/>
-      <w:r>
-        <w:t xml:space="preserve"> obsahuje proměnné popisující intenzitu dopravy, kvalitu ovzduší, meteorologické podmínky a časové souvislosti.</w:t>
-      </w:r>
-    </w:p>
-    <w:p>
-      <w:r>
-        <w:t>Počet platných měření rychlosti (</w:t>
-      </w:r>
-      <w:proofErr w:type="spellStart"/>
-      <w:r>
-        <w:t>valid_speed_count</w:t>
-      </w:r>
-      <w:proofErr w:type="spellEnd"/>
-      <w:r>
-        <w:t>) se pohyboval od 2 do 3 724 vozidel za hodinu, s mediánem 1 395. To ukazuje na výrazné rozdíly v dopravním zatížení v průběhu dne i týdne.</w:t>
+        <w:t>Po sloučení a agregaci všech vstupních dat vznikl datový rámec data, kde každý řádek představuje jednu hodinu. Tento dataset obsahuje proměnné popisující intenzitu dopravy, kvalitu ovzduší, meteorologické podmínky a časové souvislosti.</w:t>
+      </w:r>
+    </w:p>
+    <w:p>
+      <w:r>
+        <w:t>Počet platných měření rychlosti (valid_speed_count) se pohyboval od 2 do 3 724 vozidel za hodinu, s mediánem 1 395. To ukazuje na výrazné rozdíly v dopravním zatížení v průběhu dne i týdne.</w:t>
       </w:r>
     </w:p>
     <w:p>
@@ -7919,15 +6863,7 @@
     </w:p>
     <w:p>
       <w:r>
-        <w:t>Teplota vzduchu (data_temp1) se pohybovala mezi −13,2 °C a 37,0 °C, s průměrem kolem 11,8 °C. Denní průměrná teplota (</w:t>
-      </w:r>
-      <w:proofErr w:type="spellStart"/>
-      <w:r>
-        <w:t>prumerna_teplota_dne</w:t>
-      </w:r>
-      <w:proofErr w:type="spellEnd"/>
-      <w:r>
-        <w:t>) vykazovala podobné rozmezí.</w:t>
+        <w:t>Teplota vzduchu (data_temp1) se pohybovala mezi −13,2 °C a 37,0 °C, s průměrem kolem 11,8 °C. Denní průměrná teplota (prumerna_teplota_dne) vykazovala podobné rozmezí.</w:t>
       </w:r>
     </w:p>
     <w:p>
@@ -7969,36 +6905,12 @@
     </w:p>
     <w:p>
       <w:r>
-        <w:t>Rychlost větru (</w:t>
-      </w:r>
-      <w:proofErr w:type="spellStart"/>
-      <w:r>
-        <w:t>data_windSpeed</w:t>
-      </w:r>
-      <w:proofErr w:type="spellEnd"/>
-      <w:r>
-        <w:t>) se v průměru pohybovala kolem 2,7 m/s, přičemž maximální náraz dosáhl hodnoty 15,3 m/s. Síla větru (</w:t>
-      </w:r>
-      <w:proofErr w:type="spellStart"/>
-      <w:r>
-        <w:t>data_windImpact</w:t>
-      </w:r>
-      <w:proofErr w:type="spellEnd"/>
-      <w:r>
-        <w:t>) měla průměr 7,8, což představuje kombinaci rychlosti a směru.</w:t>
-      </w:r>
-    </w:p>
-    <w:p>
-      <w:r>
-        <w:t>Srážky (</w:t>
-      </w:r>
-      <w:proofErr w:type="spellStart"/>
-      <w:r>
-        <w:t>data_volumeMm</w:t>
-      </w:r>
-      <w:proofErr w:type="spellEnd"/>
-      <w:r>
-        <w:t>) byly zaznamenány jen výjimečně – průměr byl 0,02 mm a maximum 6,04 mm.</w:t>
+        <w:t>Rychlost větru (data_windSpeed) se v průměru pohybovala kolem 2,7 m/s, přičemž maximální náraz dosáhl hodnoty 15,3 m/s. Síla větru (data_windImpact) měla průměr 7,8, což představuje kombinaci rychlosti a směru.</w:t>
+      </w:r>
+    </w:p>
+    <w:p>
+      <w:r>
+        <w:t>Srážky (data_volumeMm) byly zaznamenány jen výjimečně – průměr byl 0,02 mm a maximum 6,04 mm.</w:t>
       </w:r>
     </w:p>
     <w:p/>
@@ -8503,23 +7415,7 @@
         </w:numPr>
       </w:pPr>
       <w:r>
-        <w:t>ukázka predikce na aktuálních datech (</w:t>
-      </w:r>
-      <w:proofErr w:type="spellStart"/>
-      <w:r>
-        <w:t>train</w:t>
-      </w:r>
-      <w:proofErr w:type="spellEnd"/>
-      <w:r>
-        <w:t xml:space="preserve"> vs test a známé </w:t>
-      </w:r>
-      <w:proofErr w:type="spellStart"/>
-      <w:r>
-        <w:t>regresory</w:t>
-      </w:r>
-      <w:proofErr w:type="spellEnd"/>
-      <w:r>
-        <w:t>)</w:t>
+        <w:t>ukázka predikce na aktuálních datech (train vs test a známé regresory)</w:t>
       </w:r>
     </w:p>
     <w:p/>
@@ -8537,35 +7433,19 @@
         </w:numPr>
       </w:pPr>
       <w:r>
-        <w:t>grafy s </w:t>
-      </w:r>
-      <w:proofErr w:type="spellStart"/>
-      <w:r>
-        <w:t>predikcema</w:t>
-      </w:r>
-      <w:proofErr w:type="spellEnd"/>
-      <w:r>
-        <w:t xml:space="preserve"> a intervaly spolehlivosti</w:t>
-      </w:r>
-    </w:p>
-    <w:p>
-      <w:pPr>
-        <w:pStyle w:val="Odstavecseseznamem"/>
-        <w:numPr>
-          <w:ilvl w:val="0"/>
-          <w:numId w:val="7"/>
-        </w:numPr>
-      </w:pPr>
-      <w:r>
-        <w:t xml:space="preserve">interaktivní </w:t>
-      </w:r>
-      <w:proofErr w:type="spellStart"/>
-      <w:r>
-        <w:t>výtup</w:t>
-      </w:r>
-      <w:proofErr w:type="spellEnd"/>
-      <w:r>
-        <w:t xml:space="preserve"> pro denní data: zadání 10 teplot</w:t>
+        <w:t>grafy s predikcema a intervaly spolehlivosti</w:t>
+      </w:r>
+    </w:p>
+    <w:p>
+      <w:pPr>
+        <w:pStyle w:val="Odstavecseseznamem"/>
+        <w:numPr>
+          <w:ilvl w:val="0"/>
+          <w:numId w:val="7"/>
+        </w:numPr>
+      </w:pPr>
+      <w:r>
+        <w:t>interaktivní výtup pro denní data: zadání 10 teplot</w:t>
       </w:r>
     </w:p>
     <w:p>
@@ -8577,23 +7457,13 @@
         </w:numPr>
       </w:pPr>
       <w:r>
-        <w:t xml:space="preserve">předpověď pro 10 dní dopředu, vypočtení </w:t>
-      </w:r>
-      <w:proofErr w:type="spellStart"/>
-      <w:r>
-        <w:t>předpopvědi</w:t>
-      </w:r>
-      <w:proofErr w:type="spellEnd"/>
-      <w:r>
-        <w:t xml:space="preserve"> prachu a no2</w:t>
-      </w:r>
-    </w:p>
-    <w:p>
-      <w:proofErr w:type="spellStart"/>
+        <w:t>předpověď pro 10 dní dopředu, vypočtení předpopvědi prachu a no2</w:t>
+      </w:r>
+    </w:p>
+    <w:p>
       <w:r>
         <w:t>Kroskorelace</w:t>
       </w:r>
-      <w:proofErr w:type="spellEnd"/>
     </w:p>
     <w:p>
       <w:pPr>
@@ -8661,21 +7531,8 @@
         </w:numPr>
       </w:pPr>
       <w:r>
-        <w:t xml:space="preserve">započítat ze svátků: </w:t>
-      </w:r>
-      <w:proofErr w:type="gramStart"/>
-      <w:r>
-        <w:t>velikonoce</w:t>
-      </w:r>
-      <w:proofErr w:type="gramEnd"/>
-      <w:r>
-        <w:t xml:space="preserve">, 8.5, 28.9, 28.10, </w:t>
-      </w:r>
-      <w:proofErr w:type="gramStart"/>
-      <w:r>
-        <w:t>vánoce</w:t>
-      </w:r>
-      <w:proofErr w:type="gramEnd"/>
+        <w:t>započítat ze svátků: velikonoce, 8.5, 28.9, 28.10, vánoce</w:t>
+      </w:r>
     </w:p>
     <w:p>
       <w:r>
@@ -8933,13 +7790,8 @@
           </w:tcPr>
           <w:p>
             <w:r>
-              <w:t>Test/</w:t>
-            </w:r>
-            <w:proofErr w:type="spellStart"/>
-            <w:r>
-              <w:t>train</w:t>
-            </w:r>
-            <w:proofErr w:type="spellEnd"/>
+              <w:t>Test/train</w:t>
+            </w:r>
           </w:p>
         </w:tc>
       </w:tr>
@@ -9289,13 +8141,8 @@
             <w:tcW w:w="1567" w:type="dxa"/>
           </w:tcPr>
           <w:p>
-            <w:proofErr w:type="spellStart"/>
-            <w:r>
-              <w:t>Train</w:t>
-            </w:r>
-            <w:proofErr w:type="spellEnd"/>
-            <w:r>
-              <w:t xml:space="preserve"> vs test</w:t>
+            <w:r>
+              <w:t>Train vs test</w:t>
             </w:r>
           </w:p>
         </w:tc>
@@ -9448,11 +8295,9 @@
             <w:tcW w:w="3005" w:type="dxa"/>
           </w:tcPr>
           <w:p>
-            <w:proofErr w:type="spellStart"/>
             <w:r>
               <w:t>pm</w:t>
             </w:r>
-            <w:proofErr w:type="spellEnd"/>
           </w:p>
         </w:tc>
         <w:tc>
@@ -9564,13 +8409,8 @@
         <w:pStyle w:val="Nadpis3"/>
       </w:pPr>
       <w:r>
-        <w:t xml:space="preserve">Predikce Prach – test vs </w:t>
-      </w:r>
-      <w:proofErr w:type="spellStart"/>
-      <w:r>
-        <w:t>train</w:t>
-      </w:r>
-      <w:proofErr w:type="spellEnd"/>
+        <w:t>Predikce Prach – test vs train</w:t>
+      </w:r>
     </w:p>
     <w:tbl>
       <w:tblPr>
@@ -9617,11 +8457,9 @@
             <w:tcW w:w="3005" w:type="dxa"/>
           </w:tcPr>
           <w:p>
-            <w:proofErr w:type="spellStart"/>
             <w:r>
               <w:t>pm</w:t>
             </w:r>
-            <w:proofErr w:type="spellEnd"/>
           </w:p>
         </w:tc>
         <w:tc>
@@ -9644,13 +8482,8 @@
         <w:pStyle w:val="Nadpis3"/>
       </w:pPr>
       <w:r>
-        <w:t xml:space="preserve">Predikce NO2 – test vs </w:t>
-      </w:r>
-      <w:proofErr w:type="spellStart"/>
-      <w:r>
-        <w:t>train</w:t>
-      </w:r>
-      <w:proofErr w:type="spellEnd"/>
+        <w:t>Predikce NO2 – test vs train</w:t>
+      </w:r>
     </w:p>
     <w:tbl>
       <w:tblPr>
@@ -9697,11 +8530,9 @@
             <w:tcW w:w="3005" w:type="dxa"/>
           </w:tcPr>
           <w:p>
-            <w:proofErr w:type="spellStart"/>
             <w:r>
               <w:t>pm</w:t>
             </w:r>
-            <w:proofErr w:type="spellEnd"/>
           </w:p>
         </w:tc>
         <w:tc>
@@ -9724,46 +8555,20 @@
       <w:pPr>
         <w:pStyle w:val="Nadpis1"/>
       </w:pPr>
-      <w:proofErr w:type="spellStart"/>
-      <w:r>
-        <w:t>Apache</w:t>
-      </w:r>
-      <w:proofErr w:type="spellEnd"/>
-      <w:r>
-        <w:t xml:space="preserve"> </w:t>
-      </w:r>
-      <w:proofErr w:type="spellStart"/>
-      <w:r>
-        <w:t>superset</w:t>
-      </w:r>
-      <w:proofErr w:type="spellEnd"/>
-    </w:p>
-    <w:p>
-      <w:pPr>
-        <w:pStyle w:val="Odstavecseseznamem"/>
-        <w:numPr>
-          <w:ilvl w:val="0"/>
-          <w:numId w:val="7"/>
-        </w:numPr>
-      </w:pPr>
-      <w:r>
-        <w:t xml:space="preserve">Vizualizace závislostí (jaké má </w:t>
-      </w:r>
-      <w:proofErr w:type="spellStart"/>
-      <w:r>
-        <w:t>regresory</w:t>
-      </w:r>
-      <w:proofErr w:type="spellEnd"/>
-      <w:r>
-        <w:t xml:space="preserve">, tak zobrazit vždy rozložení dat a barevně </w:t>
-      </w:r>
-      <w:proofErr w:type="spellStart"/>
-      <w:r>
-        <w:t>regresor</w:t>
-      </w:r>
-      <w:proofErr w:type="spellEnd"/>
-      <w:r>
-        <w:t>)</w:t>
+      <w:r>
+        <w:t>Apache superset</w:t>
+      </w:r>
+    </w:p>
+    <w:p>
+      <w:pPr>
+        <w:pStyle w:val="Odstavecseseznamem"/>
+        <w:numPr>
+          <w:ilvl w:val="0"/>
+          <w:numId w:val="7"/>
+        </w:numPr>
+      </w:pPr>
+      <w:r>
+        <w:t>Vizualizace závislostí (jaké má regresory, tak zobrazit vždy rozložení dat a barevně regresor)</w:t>
       </w:r>
     </w:p>
     <w:p>
@@ -9787,15 +8592,7 @@
         </w:numPr>
       </w:pPr>
       <w:r>
-        <w:t xml:space="preserve">Zobrazení kompletního modelu – tabulka závislostí pro </w:t>
-      </w:r>
-      <w:proofErr w:type="spellStart"/>
-      <w:r>
-        <w:t>pm</w:t>
-      </w:r>
-      <w:proofErr w:type="spellEnd"/>
-      <w:r>
-        <w:t xml:space="preserve"> a no2</w:t>
+        <w:t>Zobrazení kompletního modelu – tabulka závislostí pro pm a no2</w:t>
       </w:r>
     </w:p>
     <w:p/>
@@ -9872,14 +8669,12 @@
           <w:numId w:val="7"/>
         </w:numPr>
       </w:pPr>
-      <w:proofErr w:type="spellStart"/>
       <w:r>
         <w:t>B</w:t>
       </w:r>
       <w:r>
         <w:t>oxploty</w:t>
       </w:r>
-      <w:proofErr w:type="spellEnd"/>
     </w:p>
     <w:p>
       <w:pPr>
@@ -9895,13 +8690,8 @@
     </w:p>
     <w:p>
       <w:r>
-        <w:t xml:space="preserve">Ověření vlivu </w:t>
-      </w:r>
-      <w:proofErr w:type="spellStart"/>
-      <w:r>
-        <w:t>regresorů</w:t>
-      </w:r>
-      <w:proofErr w:type="spellEnd"/>
+        <w:t>Ověření vlivu regresorů</w:t>
+      </w:r>
     </w:p>
     <w:p>
       <w:pPr>
@@ -9924,13 +8714,8 @@
         </w:numPr>
       </w:pPr>
       <w:r>
-        <w:t xml:space="preserve">Vyhodnocení číselných vztahů, nejen pomocí </w:t>
-      </w:r>
-      <w:proofErr w:type="spellStart"/>
-      <w:r>
-        <w:t>okometrie</w:t>
-      </w:r>
-      <w:proofErr w:type="spellEnd"/>
+        <w:t>Vyhodnocení číselných vztahů, nejen pomocí okometrie</w:t>
+      </w:r>
     </w:p>
     <w:p>
       <w:pPr>
@@ -9970,15 +8755,7 @@
         </w:numPr>
       </w:pPr>
       <w:r>
-        <w:t xml:space="preserve">Postup modelování, použití </w:t>
-      </w:r>
-      <w:proofErr w:type="spellStart"/>
-      <w:r>
-        <w:t>regresorů</w:t>
-      </w:r>
-      <w:proofErr w:type="spellEnd"/>
-      <w:r>
-        <w:t>, sezónnosti, typy složek</w:t>
+        <w:t>Postup modelování, použití regresorů, sezónnosti, typy složek</w:t>
       </w:r>
     </w:p>
     <w:p>
@@ -10173,15 +8950,7 @@
       </w:pPr>
       <w:r>
         <w:lastRenderedPageBreak/>
-        <w:t xml:space="preserve">CSV soubor s modelem a </w:t>
-      </w:r>
-      <w:proofErr w:type="spellStart"/>
-      <w:r>
-        <w:t>predikcema</w:t>
-      </w:r>
-      <w:proofErr w:type="spellEnd"/>
-      <w:r>
-        <w:t>:</w:t>
+        <w:t>CSV soubor s modelem a predikcema:</w:t>
       </w:r>
     </w:p>
     <w:tbl>
@@ -10224,13 +8993,8 @@
             <w:tcW w:w="1503" w:type="dxa"/>
           </w:tcPr>
           <w:p>
-            <w:proofErr w:type="spellStart"/>
-            <w:r>
-              <w:t>Fitted</w:t>
-            </w:r>
-            <w:proofErr w:type="spellEnd"/>
-            <w:r>
-              <w:t xml:space="preserve"> hodnoty</w:t>
+            <w:r>
+              <w:t>Fitted hodnoty</w:t>
             </w:r>
           </w:p>
         </w:tc>
@@ -10240,13 +9004,8 @@
           </w:tcPr>
           <w:p>
             <w:r>
-              <w:t xml:space="preserve">Testovací hodnoty </w:t>
-            </w:r>
-            <w:proofErr w:type="gramStart"/>
-            <w:r>
-              <w:t>30%</w:t>
-            </w:r>
-            <w:proofErr w:type="gramEnd"/>
+              <w:t>Testovací hodnoty 30%</w:t>
+            </w:r>
           </w:p>
         </w:tc>
         <w:tc>
@@ -10264,11 +9023,9 @@
             <w:tcW w:w="1503" w:type="dxa"/>
           </w:tcPr>
           <w:p>
-            <w:proofErr w:type="spellStart"/>
             <w:r>
               <w:t>Regresory</w:t>
             </w:r>
-            <w:proofErr w:type="spellEnd"/>
           </w:p>
         </w:tc>
       </w:tr>
@@ -10319,20 +9076,309 @@
       <w:r>
         <w:t>Grafy závislostí</w:t>
       </w:r>
-    </w:p>
-    <w:p>
-      <w:r>
-        <w:t xml:space="preserve">Korelační matice mezi proměnnýma – </w:t>
-      </w:r>
-      <w:proofErr w:type="spellStart"/>
+      <w:r>
+        <w:t xml:space="preserve"> a regresní modely</w:t>
+      </w:r>
+    </w:p>
+    <w:p>
+      <w:r>
+        <w:t>Korelační matice mezi proměnnýma</w:t>
+      </w:r>
+    </w:p>
+    <w:p>
+      <w:pPr>
+        <w:pStyle w:val="Odstavecseseznamem"/>
+        <w:numPr>
+          <w:ilvl w:val="0"/>
+          <w:numId w:val="7"/>
+        </w:numPr>
+      </w:pPr>
       <w:r>
         <w:t>scatterplot</w:t>
       </w:r>
-      <w:proofErr w:type="spellEnd"/>
-      <w:r>
-        <w:t xml:space="preserve"> +</w:t>
-      </w:r>
-    </w:p>
+    </w:p>
+    <w:p>
+      <w:r>
+        <w:t>Z toho zkusit nějaké jednoduché regresní modely – ověření závislosti pomocí scatter, na to nasadit jednoduchý model pro věření pro všechny typy</w:t>
+      </w:r>
+    </w:p>
+    <w:p/>
+    <w:p/>
+    <w:p>
+      <w:pPr>
+        <w:pStyle w:val="Nadpis1"/>
+      </w:pPr>
+      <w:r>
+        <w:t>Kombinované závislosti</w:t>
+      </w:r>
+    </w:p>
+    <w:p>
+      <w:pPr>
+        <w:pStyle w:val="Nadpis2"/>
+      </w:pPr>
+      <w:r>
+        <w:t>PM</w:t>
+      </w:r>
+    </w:p>
+    <w:p>
+      <w:pPr>
+        <w:pStyle w:val="Odstavecseseznamem"/>
+        <w:numPr>
+          <w:ilvl w:val="0"/>
+          <w:numId w:val="7"/>
+        </w:numPr>
+      </w:pPr>
+      <w:r>
+        <w:t>použít model, který jsem dělal na čase</w:t>
+      </w:r>
+    </w:p>
+    <w:p>
+      <w:pPr>
+        <w:pStyle w:val="Odstavecseseznamem"/>
+        <w:numPr>
+          <w:ilvl w:val="0"/>
+          <w:numId w:val="7"/>
+        </w:numPr>
+      </w:pPr>
+      <w:r>
+        <w:t>rozdělit řadu na 2: topná x netopná sezóna</w:t>
+      </w:r>
+    </w:p>
+    <w:p>
+      <w:pPr>
+        <w:pStyle w:val="Odstavecseseznamem"/>
+        <w:numPr>
+          <w:ilvl w:val="0"/>
+          <w:numId w:val="7"/>
+        </w:numPr>
+      </w:pPr>
+      <w:r>
+        <w:t>najít, jestli pro teplotu nebo pro auta neexistuje závislost na lagu hodnot</w:t>
+      </w:r>
+    </w:p>
+    <w:p>
+      <w:pPr>
+        <w:pStyle w:val="Odstavecseseznamem"/>
+        <w:numPr>
+          <w:ilvl w:val="1"/>
+          <w:numId w:val="7"/>
+        </w:numPr>
+      </w:pPr>
+      <w:r>
+        <w:t>nějaká metoda, která najde, jestli je nějaká závislost zpožděná</w:t>
+      </w:r>
+    </w:p>
+    <w:p>
+      <w:pPr>
+        <w:pStyle w:val="Odstavecseseznamem"/>
+        <w:numPr>
+          <w:ilvl w:val="0"/>
+          <w:numId w:val="7"/>
+        </w:numPr>
+      </w:pPr>
+      <w:r>
+        <w:t>na každý model zvlášť:</w:t>
+      </w:r>
+    </w:p>
+    <w:p>
+      <w:pPr>
+        <w:pStyle w:val="Odstavecseseznamem"/>
+        <w:numPr>
+          <w:ilvl w:val="1"/>
+          <w:numId w:val="7"/>
+        </w:numPr>
+      </w:pPr>
+      <w:r>
+        <w:t>aplikovat regresi aut + teploty (popřípadě zpožděných hodnot)</w:t>
+      </w:r>
+    </w:p>
+    <w:p>
+      <w:pPr>
+        <w:pStyle w:val="Odstavecseseznamem"/>
+        <w:numPr>
+          <w:ilvl w:val="1"/>
+          <w:numId w:val="7"/>
+        </w:numPr>
+      </w:pPr>
+      <w:r>
+        <w:t>vyzkoušet různé modely – dlm, lm, GAM, arima, sarima, arimax</w:t>
+      </w:r>
+    </w:p>
+    <w:p>
+      <w:pPr>
+        <w:pStyle w:val="Odstavecseseznamem"/>
+        <w:numPr>
+          <w:ilvl w:val="0"/>
+          <w:numId w:val="7"/>
+        </w:numPr>
+      </w:pPr>
+      <w:r>
+        <w:t>kontrola předpokladů</w:t>
+      </w:r>
+    </w:p>
+    <w:p>
+      <w:pPr>
+        <w:pStyle w:val="Odstavecseseznamem"/>
+        <w:numPr>
+          <w:ilvl w:val="1"/>
+          <w:numId w:val="7"/>
+        </w:numPr>
+      </w:pPr>
+      <w:r>
+        <w:t>rezidua, rozložení, významnost modelu, AIC, BIC</w:t>
+      </w:r>
+    </w:p>
+    <w:p>
+      <w:pPr>
+        <w:pStyle w:val="Odstavecseseznamem"/>
+        <w:numPr>
+          <w:ilvl w:val="0"/>
+          <w:numId w:val="7"/>
+        </w:numPr>
+      </w:pPr>
+      <w:r>
+        <w:t>grafy:</w:t>
+      </w:r>
+    </w:p>
+    <w:p>
+      <w:pPr>
+        <w:pStyle w:val="Odstavecseseznamem"/>
+        <w:numPr>
+          <w:ilvl w:val="1"/>
+          <w:numId w:val="7"/>
+        </w:numPr>
+      </w:pPr>
+      <w:r>
+        <w:t>fit vs skutečné hodnoty pro netopnou i topnou sezónu zvlášť</w:t>
+      </w:r>
+    </w:p>
+    <w:p>
+      <w:pPr>
+        <w:pStyle w:val="Odstavecseseznamem"/>
+        <w:numPr>
+          <w:ilvl w:val="1"/>
+          <w:numId w:val="7"/>
+        </w:numPr>
+      </w:pPr>
+      <w:r>
+        <w:t>natrénovat model na 70% dat a pak otestovat na 30% dat – pro netopnou i topnou sezónu zvlášť</w:t>
+      </w:r>
+    </w:p>
+    <w:p>
+      <w:r>
+        <w:br w:type="page"/>
+      </w:r>
+    </w:p>
+    <w:p>
+      <w:pPr>
+        <w:pStyle w:val="Nadpis1"/>
+      </w:pPr>
+      <w:r>
+        <w:lastRenderedPageBreak/>
+        <w:t>Lagy</w:t>
+      </w:r>
+    </w:p>
+    <w:tbl>
+      <w:tblPr>
+        <w:tblStyle w:val="Mkatabulky"/>
+        <w:tblW w:w="0" w:type="auto"/>
+        <w:tblLook w:val="04A0" w:firstRow="1" w:lastRow="0" w:firstColumn="1" w:lastColumn="0" w:noHBand="0" w:noVBand="1"/>
+      </w:tblPr>
+      <w:tblGrid>
+        <w:gridCol w:w="2254"/>
+        <w:gridCol w:w="2254"/>
+        <w:gridCol w:w="2254"/>
+        <w:gridCol w:w="2254"/>
+      </w:tblGrid>
+      <w:tr>
+        <w:tc>
+          <w:tcPr>
+            <w:tcW w:w="2254" w:type="dxa"/>
+          </w:tcPr>
+          <w:p>
+            <w:r>
+              <w:t>No2</w:t>
+            </w:r>
+          </w:p>
+        </w:tc>
+        <w:tc>
+          <w:tcPr>
+            <w:tcW w:w="2254" w:type="dxa"/>
+          </w:tcPr>
+          <w:p>
+            <w:r>
+              <w:t>topna</w:t>
+            </w:r>
+          </w:p>
+        </w:tc>
+        <w:tc>
+          <w:tcPr>
+            <w:tcW w:w="2254" w:type="dxa"/>
+          </w:tcPr>
+          <w:p>
+            <w:r>
+              <w:t>Auta</w:t>
+            </w:r>
+            <w:r>
+              <w:br/>
+              <w:t>teplota</w:t>
+            </w:r>
+            <w:r>
+              <w:br/>
+              <w:t>vlhkost</w:t>
+            </w:r>
+            <w:r>
+              <w:br/>
+              <w:t>tlak</w:t>
+            </w:r>
+            <w:r>
+              <w:br/>
+              <w:t>vitr</w:t>
+            </w:r>
+            <w:r>
+              <w:br/>
+              <w:t>srazky</w:t>
+            </w:r>
+          </w:p>
+        </w:tc>
+        <w:tc>
+          <w:tcPr>
+            <w:tcW w:w="2254" w:type="dxa"/>
+          </w:tcPr>
+          <w:p>
+            <w:r>
+              <w:t>3</w:t>
+            </w:r>
+          </w:p>
+          <w:p>
+            <w:r>
+              <w:t>3</w:t>
+            </w:r>
+            <w:r>
+              <w:br/>
+            </w:r>
+          </w:p>
+        </w:tc>
+      </w:tr>
+    </w:tbl>
+    <w:p>
+      <w:r>
+        <w:br w:type="page"/>
+      </w:r>
+    </w:p>
+    <w:p>
+      <w:r>
+        <w:lastRenderedPageBreak/>
+        <w:br w:type="page"/>
+      </w:r>
+    </w:p>
+    <w:p>
+      <w:r>
+        <w:lastRenderedPageBreak/>
+        <w:br w:type="page"/>
+      </w:r>
+    </w:p>
+    <w:p/>
     <w:sectPr>
       <w:pgSz w:w="11906" w:h="16838"/>
       <w:pgMar w:top="1440" w:right="1440" w:bottom="1440" w:left="1440" w:header="708" w:footer="708" w:gutter="0"/>

</xml_diff>